<commit_message>
Retarget practical lesson plan to Software Development discipline
Co-Authored-By: Claude Fable 5.1 <noreply@anthropic.com>
Claude-Session: https://claude.ai/code/session_01LeAKLyWUugijbBRVjkp6kE
</commit_message>
<xml_diff>
--- a/Практическое_занятие_Методы_и_формы_обучения.docx
+++ b/Практическое_занятие_Методы_и_формы_обучения.docx
@@ -15,7 +15,7 @@
           <w:sz w:val="30"/>
           <w:szCs w:val="30"/>
         </w:rPr>
-        <w:t xml:space="preserve">Практическое занятие</w:t>
+        <w:t xml:space="preserve">Практическое занятие по дисциплине «Разработка программного обеспечения»</w:t>
       </w:r>
     </w:p>
     <w:p>
@@ -31,7 +31,7 @@
           <w:sz w:val="28"/>
           <w:szCs w:val="28"/>
         </w:rPr>
-        <w:t xml:space="preserve">«Методы и формы организации обучения в высшей школе»</w:t>
+        <w:t xml:space="preserve">Тема: «Code review и управление качеством кода в команде»</w:t>
       </w:r>
     </w:p>
     <w:p>
@@ -47,7 +47,7 @@
           <w:sz w:val="26"/>
           <w:szCs w:val="26"/>
         </w:rPr>
-        <w:t xml:space="preserve">План-конспект с упражнениями и анализом ситуации</w:t>
+        <w:t xml:space="preserve">План-конспект с упражнениями и анализом ситуации. Разработан в контексте темы 9 «Методы и формы организации обучения в высшей школе»</w:t>
       </w:r>
     </w:p>
     <w:p>
@@ -199,7 +199,7 @@
                 <w:sz w:val="22"/>
                 <w:szCs w:val="22"/>
               </w:rPr>
-              <w:t xml:space="preserve">Педагогика высшей школы (магистратура, 1 курс)</w:t>
+              <w:t xml:space="preserve">Разработка программного обеспечения (магистратура, 1 курс)</w:t>
             </w:r>
           </w:p>
         </w:tc>
@@ -239,7 +239,7 @@
                 <w:sz w:val="22"/>
                 <w:szCs w:val="22"/>
               </w:rPr>
-              <w:t xml:space="preserve">Тема</w:t>
+              <w:t xml:space="preserve">Тема занятия</w:t>
             </w:r>
           </w:p>
         </w:tc>
@@ -274,7 +274,7 @@
                 <w:sz w:val="22"/>
                 <w:szCs w:val="22"/>
               </w:rPr>
-              <w:t xml:space="preserve">Методы и формы организации обучения в высшей школе</w:t>
+              <w:t xml:space="preserve">Code review и управление качеством кода в команде</w:t>
             </w:r>
           </w:p>
         </w:tc>
@@ -570,7 +570,7 @@
                 <w:sz w:val="22"/>
                 <w:szCs w:val="22"/>
               </w:rPr>
-              <w:t xml:space="preserve">Сформировать умение различать метод, приём, средство и форму обучения и осознанно выбирать их под цель занятия и условия обучения в высшей школе</w:t>
+              <w:t xml:space="preserve">Сформировать умение находить дефекты и «запахи кода» при ревью, формулировать конструктивные замечания и проектировать процесс контроля качества кода для команды</w:t>
             </w:r>
           </w:p>
         </w:tc>
@@ -643,7 +643,7 @@
                 <w:sz w:val="22"/>
                 <w:szCs w:val="22"/>
               </w:rPr>
-              <w:t xml:space="preserve">Образовательная: закрепить основные понятия темы. Развивающая: развить умение анализировать педагогическую ситуацию и аргументировать выбор. Воспитательная: сформировать ответственное отношение к проектированию занятия</w:t>
+              <w:t xml:space="preserve">Образовательная: закрепить виды дефектов, принципы code review, понятия Definition of Done и CI. Развивающая: развить умение анализировать производственную ситуацию и аргументировать инженерное решение. Воспитательная: сформировать культуру уважительной и предметной обратной связи</w:t>
             </w:r>
           </w:p>
         </w:tc>
@@ -791,7 +791,7 @@
                 <w:sz w:val="22"/>
                 <w:szCs w:val="22"/>
               </w:rPr>
-              <w:t xml:space="preserve">Раздаточные карточки (упражнения 1–2), текст кейса, лист самооценки, доска или флипчарт, проектор</w:t>
+              <w:t xml:space="preserve">Раздаточные листы с фрагментами кода (упражнение 1), шаблон чек-листа (упражнение 2), текст кейса, рубрика оценки, проектор, доска</w:t>
             </w:r>
           </w:p>
         </w:tc>
@@ -866,7 +866,7 @@
                 <w:sz w:val="22"/>
                 <w:szCs w:val="22"/>
               </w:rPr>
-              <w:t xml:space="preserve">Магистрант: (1) относит конкретный элемент занятия к методу, приёму, средству или форме; (2) подбирает метод и форму под заданную цель; (3) анализирует ситуацию и предлагает обоснованное педагогическое решение</w:t>
+              <w:t xml:space="preserve">Магистрант: (1) классифицирует найденный дефект по типу и серьёзности; (2) формулирует замечание в ревью по правилу «факт, последствие, предложение»; (3) анализирует ситуацию в команде и предлагает обоснованный процесс контроля качества</w:t>
             </w:r>
           </w:p>
         </w:tc>
@@ -903,10 +903,10 @@
       </w:tblPr>
       <w:tblGrid>
         <w:gridCol w:w="520"/>
-        <w:gridCol w:w="2500"/>
-        <w:gridCol w:w="1100"/>
-        <w:gridCol w:w="3200"/>
-        <w:gridCol w:w="2318"/>
+        <w:gridCol w:w="2300"/>
+        <w:gridCol w:w="1000"/>
+        <w:gridCol w:w="3100"/>
+        <w:gridCol w:w="2718"/>
       </w:tblGrid>
       <w:tr>
         <w:trPr>
@@ -950,7 +950,7 @@
         </w:tc>
         <w:tc>
           <w:tcPr>
-            <w:tcW w:type="dxa" w:w="2500"/>
+            <w:tcW w:type="dxa" w:w="2300"/>
             <w:tcBorders>
               <w:top w:val="single" w:color="BFBFBF" w:sz="6"/>
               <w:left w:val="single" w:color="BFBFBF" w:sz="6"/>
@@ -986,7 +986,7 @@
         </w:tc>
         <w:tc>
           <w:tcPr>
-            <w:tcW w:type="dxa" w:w="1100"/>
+            <w:tcW w:type="dxa" w:w="1000"/>
             <w:tcBorders>
               <w:top w:val="single" w:color="BFBFBF" w:sz="6"/>
               <w:left w:val="single" w:color="BFBFBF" w:sz="6"/>
@@ -1022,7 +1022,7 @@
         </w:tc>
         <w:tc>
           <w:tcPr>
-            <w:tcW w:type="dxa" w:w="3200"/>
+            <w:tcW w:type="dxa" w:w="3100"/>
             <w:tcBorders>
               <w:top w:val="single" w:color="BFBFBF" w:sz="6"/>
               <w:left w:val="single" w:color="BFBFBF" w:sz="6"/>
@@ -1058,7 +1058,7 @@
         </w:tc>
         <w:tc>
           <w:tcPr>
-            <w:tcW w:type="dxa" w:w="2318"/>
+            <w:tcW w:type="dxa" w:w="2718"/>
             <w:tcBorders>
               <w:top w:val="single" w:color="BFBFBF" w:sz="6"/>
               <w:left w:val="single" w:color="BFBFBF" w:sz="6"/>
@@ -1133,7 +1133,7 @@
         </w:tc>
         <w:tc>
           <w:tcPr>
-            <w:tcW w:type="dxa" w:w="2500"/>
+            <w:tcW w:type="dxa" w:w="2300"/>
             <w:tcBorders>
               <w:top w:val="single" w:color="BFBFBF" w:sz="6"/>
               <w:left w:val="single" w:color="BFBFBF" w:sz="6"/>
@@ -1167,7 +1167,7 @@
         </w:tc>
         <w:tc>
           <w:tcPr>
-            <w:tcW w:type="dxa" w:w="1100"/>
+            <w:tcW w:type="dxa" w:w="1000"/>
             <w:tcBorders>
               <w:top w:val="single" w:color="BFBFBF" w:sz="6"/>
               <w:left w:val="single" w:color="BFBFBF" w:sz="6"/>
@@ -1201,7 +1201,7 @@
         </w:tc>
         <w:tc>
           <w:tcPr>
-            <w:tcW w:type="dxa" w:w="3200"/>
+            <w:tcW w:type="dxa" w:w="3100"/>
             <w:tcBorders>
               <w:top w:val="single" w:color="BFBFBF" w:sz="6"/>
               <w:left w:val="single" w:color="BFBFBF" w:sz="6"/>
@@ -1235,7 +1235,7 @@
         </w:tc>
         <w:tc>
           <w:tcPr>
-            <w:tcW w:type="dxa" w:w="2318"/>
+            <w:tcW w:type="dxa" w:w="2718"/>
             <w:tcBorders>
               <w:top w:val="single" w:color="BFBFBF" w:sz="6"/>
               <w:left w:val="single" w:color="BFBFBF" w:sz="6"/>
@@ -1309,7 +1309,7 @@
         </w:tc>
         <w:tc>
           <w:tcPr>
-            <w:tcW w:type="dxa" w:w="2500"/>
+            <w:tcW w:type="dxa" w:w="2300"/>
             <w:tcBorders>
               <w:top w:val="single" w:color="BFBFBF" w:sz="6"/>
               <w:left w:val="single" w:color="BFBFBF" w:sz="6"/>
@@ -1338,13 +1338,13 @@
                 <w:sz w:val="22"/>
                 <w:szCs w:val="22"/>
               </w:rPr>
-              <w:t xml:space="preserve">Актуализация: разминка «Четыре корзины»</w:t>
-            </w:r>
-          </w:p>
-        </w:tc>
-        <w:tc>
-          <w:tcPr>
-            <w:tcW w:type="dxa" w:w="1100"/>
+              <w:t xml:space="preserve">Актуализация: упражнение «Найди дефект»</w:t>
+            </w:r>
+          </w:p>
+        </w:tc>
+        <w:tc>
+          <w:tcPr>
+            <w:tcW w:type="dxa" w:w="1000"/>
             <w:tcBorders>
               <w:top w:val="single" w:color="BFBFBF" w:sz="6"/>
               <w:left w:val="single" w:color="BFBFBF" w:sz="6"/>
@@ -1373,13 +1373,13 @@
                 <w:sz w:val="22"/>
                 <w:szCs w:val="22"/>
               </w:rPr>
-              <w:t xml:space="preserve">10 мин</w:t>
-            </w:r>
-          </w:p>
-        </w:tc>
-        <w:tc>
-          <w:tcPr>
-            <w:tcW w:type="dxa" w:w="3200"/>
+              <w:t xml:space="preserve">15 мин</w:t>
+            </w:r>
+          </w:p>
+        </w:tc>
+        <w:tc>
+          <w:tcPr>
+            <w:tcW w:type="dxa" w:w="3100"/>
             <w:tcBorders>
               <w:top w:val="single" w:color="BFBFBF" w:sz="6"/>
               <w:left w:val="single" w:color="BFBFBF" w:sz="6"/>
@@ -1408,13 +1408,13 @@
                 <w:sz w:val="22"/>
                 <w:szCs w:val="22"/>
               </w:rPr>
-              <w:t xml:space="preserve">Упражнение 1. Студенты индивидуально раскладывают 12 карточек по четырём категориям, затем сверка в парах</w:t>
-            </w:r>
-          </w:p>
-        </w:tc>
-        <w:tc>
-          <w:tcPr>
-            <w:tcW w:type="dxa" w:w="2318"/>
+              <w:t xml:space="preserve">Упражнение 1. Студенты индивидуально находят и классифицируют дефекты в 6 фрагментах кода, затем сверяют ответы в парах</w:t>
+            </w:r>
+          </w:p>
+        </w:tc>
+        <w:tc>
+          <w:tcPr>
+            <w:tcW w:type="dxa" w:w="2718"/>
             <w:tcBorders>
               <w:top w:val="single" w:color="BFBFBF" w:sz="6"/>
               <w:left w:val="single" w:color="BFBFBF" w:sz="6"/>
@@ -1443,7 +1443,7 @@
                 <w:sz w:val="22"/>
                 <w:szCs w:val="22"/>
               </w:rPr>
-              <w:t xml:space="preserve">Упражнение; индивидуально → в парах</w:t>
+              <w:t xml:space="preserve">Упражнение, репродуктивный и частично-поисковый методы; индивидуально → в парах</w:t>
             </w:r>
           </w:p>
         </w:tc>
@@ -1488,109 +1488,109 @@
         </w:tc>
         <w:tc>
           <w:tcPr>
-            <w:tcW w:type="dxa" w:w="2500"/>
-            <w:tcBorders>
-              <w:top w:val="single" w:color="BFBFBF" w:sz="6"/>
-              <w:left w:val="single" w:color="BFBFBF" w:sz="6"/>
-              <w:bottom w:val="single" w:color="BFBFBF" w:sz="6"/>
-              <w:right w:val="single" w:color="BFBFBF" w:sz="6"/>
-            </w:tcBorders>
-            <w:tcMar>
-              <w:top w:type="dxa" w:w="70"/>
-              <w:left w:type="dxa" w:w="110"/>
-              <w:bottom w:type="dxa" w:w="70"/>
-              <w:right w:type="dxa" w:w="110"/>
-            </w:tcMar>
-            <w:vAlign w:val="center"/>
-          </w:tcPr>
-          <w:p>
-            <w:pPr>
-              <w:spacing w:after="50" w:line="264"/>
-              <w:jc w:val="left"/>
-            </w:pPr>
-            <w:r>
-              <w:rPr>
-                <w:rFonts w:ascii="Times New Roman" w:cs="Times New Roman" w:eastAsia="Times New Roman" w:hAnsi="Times New Roman"/>
-                <w:b w:val="false"/>
-                <w:bCs w:val="false"/>
-                <w:sz w:val="22"/>
-                <w:szCs w:val="22"/>
-              </w:rPr>
-              <w:t xml:space="preserve">Упражнение «От цели к форме»</w:t>
-            </w:r>
-          </w:p>
-        </w:tc>
-        <w:tc>
-          <w:tcPr>
-            <w:tcW w:type="dxa" w:w="1100"/>
-            <w:tcBorders>
-              <w:top w:val="single" w:color="BFBFBF" w:sz="6"/>
-              <w:left w:val="single" w:color="BFBFBF" w:sz="6"/>
-              <w:bottom w:val="single" w:color="BFBFBF" w:sz="6"/>
-              <w:right w:val="single" w:color="BFBFBF" w:sz="6"/>
-            </w:tcBorders>
-            <w:tcMar>
-              <w:top w:type="dxa" w:w="70"/>
-              <w:left w:type="dxa" w:w="110"/>
-              <w:bottom w:type="dxa" w:w="70"/>
-              <w:right w:type="dxa" w:w="110"/>
-            </w:tcMar>
-            <w:vAlign w:val="center"/>
-          </w:tcPr>
-          <w:p>
-            <w:pPr>
-              <w:spacing w:after="50" w:line="264"/>
-              <w:jc w:val="left"/>
-            </w:pPr>
-            <w:r>
-              <w:rPr>
-                <w:rFonts w:ascii="Times New Roman" w:cs="Times New Roman" w:eastAsia="Times New Roman" w:hAnsi="Times New Roman"/>
-                <w:b w:val="false"/>
-                <w:bCs w:val="false"/>
-                <w:sz w:val="22"/>
-                <w:szCs w:val="22"/>
-              </w:rPr>
-              <w:t xml:space="preserve">20 мин</w:t>
-            </w:r>
-          </w:p>
-        </w:tc>
-        <w:tc>
-          <w:tcPr>
-            <w:tcW w:type="dxa" w:w="3200"/>
-            <w:tcBorders>
-              <w:top w:val="single" w:color="BFBFBF" w:sz="6"/>
-              <w:left w:val="single" w:color="BFBFBF" w:sz="6"/>
-              <w:bottom w:val="single" w:color="BFBFBF" w:sz="6"/>
-              <w:right w:val="single" w:color="BFBFBF" w:sz="6"/>
-            </w:tcBorders>
-            <w:tcMar>
-              <w:top w:type="dxa" w:w="70"/>
-              <w:left w:type="dxa" w:w="110"/>
-              <w:bottom w:type="dxa" w:w="70"/>
-              <w:right w:type="dxa" w:w="110"/>
-            </w:tcMar>
-            <w:vAlign w:val="center"/>
-          </w:tcPr>
-          <w:p>
-            <w:pPr>
-              <w:spacing w:after="50" w:line="264"/>
-              <w:jc w:val="left"/>
-            </w:pPr>
-            <w:r>
-              <w:rPr>
-                <w:rFonts w:ascii="Times New Roman" w:cs="Times New Roman" w:eastAsia="Times New Roman" w:hAnsi="Times New Roman"/>
-                <w:b w:val="false"/>
-                <w:bCs w:val="false"/>
-                <w:sz w:val="22"/>
-                <w:szCs w:val="22"/>
-              </w:rPr>
-              <w:t xml:space="preserve">Упражнение 2. Малые группы получают 5 учебных целей и подбирают метод, форму и средство с обоснованием. Представление результата по одной цели от группы</w:t>
-            </w:r>
-          </w:p>
-        </w:tc>
-        <w:tc>
-          <w:tcPr>
-            <w:tcW w:type="dxa" w:w="2318"/>
+            <w:tcW w:type="dxa" w:w="2300"/>
+            <w:tcBorders>
+              <w:top w:val="single" w:color="BFBFBF" w:sz="6"/>
+              <w:left w:val="single" w:color="BFBFBF" w:sz="6"/>
+              <w:bottom w:val="single" w:color="BFBFBF" w:sz="6"/>
+              <w:right w:val="single" w:color="BFBFBF" w:sz="6"/>
+            </w:tcBorders>
+            <w:tcMar>
+              <w:top w:type="dxa" w:w="70"/>
+              <w:left w:type="dxa" w:w="110"/>
+              <w:bottom w:type="dxa" w:w="70"/>
+              <w:right w:type="dxa" w:w="110"/>
+            </w:tcMar>
+            <w:vAlign w:val="center"/>
+          </w:tcPr>
+          <w:p>
+            <w:pPr>
+              <w:spacing w:after="50" w:line="264"/>
+              <w:jc w:val="left"/>
+            </w:pPr>
+            <w:r>
+              <w:rPr>
+                <w:rFonts w:ascii="Times New Roman" w:cs="Times New Roman" w:eastAsia="Times New Roman" w:hAnsi="Times New Roman"/>
+                <w:b w:val="false"/>
+                <w:bCs w:val="false"/>
+                <w:sz w:val="22"/>
+                <w:szCs w:val="22"/>
+              </w:rPr>
+              <w:t xml:space="preserve">Упражнение «Замечание в ревью»</w:t>
+            </w:r>
+          </w:p>
+        </w:tc>
+        <w:tc>
+          <w:tcPr>
+            <w:tcW w:type="dxa" w:w="1000"/>
+            <w:tcBorders>
+              <w:top w:val="single" w:color="BFBFBF" w:sz="6"/>
+              <w:left w:val="single" w:color="BFBFBF" w:sz="6"/>
+              <w:bottom w:val="single" w:color="BFBFBF" w:sz="6"/>
+              <w:right w:val="single" w:color="BFBFBF" w:sz="6"/>
+            </w:tcBorders>
+            <w:tcMar>
+              <w:top w:type="dxa" w:w="70"/>
+              <w:left w:type="dxa" w:w="110"/>
+              <w:bottom w:type="dxa" w:w="70"/>
+              <w:right w:type="dxa" w:w="110"/>
+            </w:tcMar>
+            <w:vAlign w:val="center"/>
+          </w:tcPr>
+          <w:p>
+            <w:pPr>
+              <w:spacing w:after="50" w:line="264"/>
+              <w:jc w:val="left"/>
+            </w:pPr>
+            <w:r>
+              <w:rPr>
+                <w:rFonts w:ascii="Times New Roman" w:cs="Times New Roman" w:eastAsia="Times New Roman" w:hAnsi="Times New Roman"/>
+                <w:b w:val="false"/>
+                <w:bCs w:val="false"/>
+                <w:sz w:val="22"/>
+                <w:szCs w:val="22"/>
+              </w:rPr>
+              <w:t xml:space="preserve">15 мин</w:t>
+            </w:r>
+          </w:p>
+        </w:tc>
+        <w:tc>
+          <w:tcPr>
+            <w:tcW w:type="dxa" w:w="3100"/>
+            <w:tcBorders>
+              <w:top w:val="single" w:color="BFBFBF" w:sz="6"/>
+              <w:left w:val="single" w:color="BFBFBF" w:sz="6"/>
+              <w:bottom w:val="single" w:color="BFBFBF" w:sz="6"/>
+              <w:right w:val="single" w:color="BFBFBF" w:sz="6"/>
+            </w:tcBorders>
+            <w:tcMar>
+              <w:top w:type="dxa" w:w="70"/>
+              <w:left w:type="dxa" w:w="110"/>
+              <w:bottom w:type="dxa" w:w="70"/>
+              <w:right w:type="dxa" w:w="110"/>
+            </w:tcMar>
+            <w:vAlign w:val="center"/>
+          </w:tcPr>
+          <w:p>
+            <w:pPr>
+              <w:spacing w:after="50" w:line="264"/>
+              <w:jc w:val="left"/>
+            </w:pPr>
+            <w:r>
+              <w:rPr>
+                <w:rFonts w:ascii="Times New Roman" w:cs="Times New Roman" w:eastAsia="Times New Roman" w:hAnsi="Times New Roman"/>
+                <w:b w:val="false"/>
+                <w:bCs w:val="false"/>
+                <w:sz w:val="22"/>
+                <w:szCs w:val="22"/>
+              </w:rPr>
+              <w:t xml:space="preserve">Упражнение 2. Малые группы переписывают 5 плохих комментариев ревьюера по правилу «факт, последствие, предложение»</w:t>
+            </w:r>
+          </w:p>
+        </w:tc>
+        <w:tc>
+          <w:tcPr>
+            <w:tcW w:type="dxa" w:w="2718"/>
             <w:tcBorders>
               <w:top w:val="single" w:color="BFBFBF" w:sz="6"/>
               <w:left w:val="single" w:color="BFBFBF" w:sz="6"/>
@@ -1664,7 +1664,7 @@
         </w:tc>
         <w:tc>
           <w:tcPr>
-            <w:tcW w:type="dxa" w:w="2500"/>
+            <w:tcW w:type="dxa" w:w="2300"/>
             <w:tcBorders>
               <w:top w:val="single" w:color="BFBFBF" w:sz="6"/>
               <w:left w:val="single" w:color="BFBFBF" w:sz="6"/>
@@ -1699,7 +1699,7 @@
         </w:tc>
         <w:tc>
           <w:tcPr>
-            <w:tcW w:type="dxa" w:w="1100"/>
+            <w:tcW w:type="dxa" w:w="1000"/>
             <w:tcBorders>
               <w:top w:val="single" w:color="BFBFBF" w:sz="6"/>
               <w:left w:val="single" w:color="BFBFBF" w:sz="6"/>
@@ -1734,7 +1734,7 @@
         </w:tc>
         <w:tc>
           <w:tcPr>
-            <w:tcW w:type="dxa" w:w="3200"/>
+            <w:tcW w:type="dxa" w:w="3100"/>
             <w:tcBorders>
               <w:top w:val="single" w:color="BFBFBF" w:sz="6"/>
               <w:left w:val="single" w:color="BFBFBF" w:sz="6"/>
@@ -1769,7 +1769,7 @@
         </w:tc>
         <w:tc>
           <w:tcPr>
-            <w:tcW w:type="dxa" w:w="2318"/>
+            <w:tcW w:type="dxa" w:w="2718"/>
             <w:tcBorders>
               <w:top w:val="single" w:color="BFBFBF" w:sz="6"/>
               <w:left w:val="single" w:color="BFBFBF" w:sz="6"/>
@@ -1843,7 +1843,7 @@
         </w:tc>
         <w:tc>
           <w:tcPr>
-            <w:tcW w:type="dxa" w:w="2500"/>
+            <w:tcW w:type="dxa" w:w="2300"/>
             <w:tcBorders>
               <w:top w:val="single" w:color="BFBFBF" w:sz="6"/>
               <w:left w:val="single" w:color="BFBFBF" w:sz="6"/>
@@ -1877,7 +1877,7 @@
         </w:tc>
         <w:tc>
           <w:tcPr>
-            <w:tcW w:type="dxa" w:w="1100"/>
+            <w:tcW w:type="dxa" w:w="1000"/>
             <w:tcBorders>
               <w:top w:val="single" w:color="BFBFBF" w:sz="6"/>
               <w:left w:val="single" w:color="BFBFBF" w:sz="6"/>
@@ -1911,41 +1911,41 @@
         </w:tc>
         <w:tc>
           <w:tcPr>
-            <w:tcW w:type="dxa" w:w="3200"/>
-            <w:tcBorders>
-              <w:top w:val="single" w:color="BFBFBF" w:sz="6"/>
-              <w:left w:val="single" w:color="BFBFBF" w:sz="6"/>
-              <w:bottom w:val="single" w:color="BFBFBF" w:sz="6"/>
-              <w:right w:val="single" w:color="BFBFBF" w:sz="6"/>
-            </w:tcBorders>
-            <w:tcMar>
-              <w:top w:type="dxa" w:w="70"/>
-              <w:left w:type="dxa" w:w="110"/>
-              <w:bottom w:type="dxa" w:w="70"/>
-              <w:right w:type="dxa" w:w="110"/>
-            </w:tcMar>
-            <w:vAlign w:val="center"/>
-          </w:tcPr>
-          <w:p>
-            <w:pPr>
-              <w:spacing w:after="50" w:line="264"/>
-              <w:jc w:val="left"/>
-            </w:pPr>
-            <w:r>
-              <w:rPr>
-                <w:rFonts w:ascii="Times New Roman" w:cs="Times New Roman" w:eastAsia="Times New Roman" w:hAnsi="Times New Roman"/>
-                <w:b w:val="false"/>
-                <w:bCs w:val="false"/>
-                <w:sz w:val="22"/>
-                <w:szCs w:val="22"/>
-              </w:rPr>
-              <w:t xml:space="preserve">Группы оценивают решение соседней группы по рубрике из 4 критериев, дают один совет</w:t>
-            </w:r>
-          </w:p>
-        </w:tc>
-        <w:tc>
-          <w:tcPr>
-            <w:tcW w:type="dxa" w:w="2318"/>
+            <w:tcW w:type="dxa" w:w="3100"/>
+            <w:tcBorders>
+              <w:top w:val="single" w:color="BFBFBF" w:sz="6"/>
+              <w:left w:val="single" w:color="BFBFBF" w:sz="6"/>
+              <w:bottom w:val="single" w:color="BFBFBF" w:sz="6"/>
+              <w:right w:val="single" w:color="BFBFBF" w:sz="6"/>
+            </w:tcBorders>
+            <w:tcMar>
+              <w:top w:type="dxa" w:w="70"/>
+              <w:left w:type="dxa" w:w="110"/>
+              <w:bottom w:type="dxa" w:w="70"/>
+              <w:right w:type="dxa" w:w="110"/>
+            </w:tcMar>
+            <w:vAlign w:val="center"/>
+          </w:tcPr>
+          <w:p>
+            <w:pPr>
+              <w:spacing w:after="50" w:line="264"/>
+              <w:jc w:val="left"/>
+            </w:pPr>
+            <w:r>
+              <w:rPr>
+                <w:rFonts w:ascii="Times New Roman" w:cs="Times New Roman" w:eastAsia="Times New Roman" w:hAnsi="Times New Roman"/>
+                <w:b w:val="false"/>
+                <w:bCs w:val="false"/>
+                <w:sz w:val="22"/>
+                <w:szCs w:val="22"/>
+              </w:rPr>
+              <w:t xml:space="preserve">Группы оценивают решение соседней группы по рубрике из 4 критериев и дают один совет</w:t>
+            </w:r>
+          </w:p>
+        </w:tc>
+        <w:tc>
+          <w:tcPr>
+            <w:tcW w:type="dxa" w:w="2718"/>
             <w:tcBorders>
               <w:top w:val="single" w:color="BFBFBF" w:sz="6"/>
               <w:left w:val="single" w:color="BFBFBF" w:sz="6"/>
@@ -2019,7 +2019,7 @@
         </w:tc>
         <w:tc>
           <w:tcPr>
-            <w:tcW w:type="dxa" w:w="2500"/>
+            <w:tcW w:type="dxa" w:w="2300"/>
             <w:tcBorders>
               <w:top w:val="single" w:color="BFBFBF" w:sz="6"/>
               <w:left w:val="single" w:color="BFBFBF" w:sz="6"/>
@@ -2054,7 +2054,7 @@
         </w:tc>
         <w:tc>
           <w:tcPr>
-            <w:tcW w:type="dxa" w:w="1100"/>
+            <w:tcW w:type="dxa" w:w="1000"/>
             <w:tcBorders>
               <w:top w:val="single" w:color="BFBFBF" w:sz="6"/>
               <w:left w:val="single" w:color="BFBFBF" w:sz="6"/>
@@ -2089,7 +2089,7 @@
         </w:tc>
         <w:tc>
           <w:tcPr>
-            <w:tcW w:type="dxa" w:w="3200"/>
+            <w:tcW w:type="dxa" w:w="3100"/>
             <w:tcBorders>
               <w:top w:val="single" w:color="BFBFBF" w:sz="6"/>
               <w:left w:val="single" w:color="BFBFBF" w:sz="6"/>
@@ -2124,7 +2124,7 @@
         </w:tc>
         <w:tc>
           <w:tcPr>
-            <w:tcW w:type="dxa" w:w="2318"/>
+            <w:tcW w:type="dxa" w:w="2718"/>
             <w:tcBorders>
               <w:top w:val="single" w:color="BFBFBF" w:sz="6"/>
               <w:left w:val="single" w:color="BFBFBF" w:sz="6"/>
@@ -2175,7 +2175,7 @@
           <w:sz w:val="26"/>
           <w:szCs w:val="26"/>
         </w:rPr>
-        <w:t xml:space="preserve">Общая логика: от узнавания понятий (упражнение 1) к их применению (упражнение 2) и далее к анализу реальной ситуации, где понятия нужно использовать для диагностики и принятия решения (кейс).</w:t>
+        <w:t xml:space="preserve">Общая логика: от узнавания дефектов (упражнение 1) к умению говорить о них (упражнение 2) и далее к проектированию процесса, в котором дефекты не доходят до релиза (кейс).</w:t>
       </w:r>
     </w:p>
     <w:p>
@@ -2192,7 +2192,7 @@
           <w:sz w:val="30"/>
           <w:szCs w:val="30"/>
         </w:rPr>
-        <w:t xml:space="preserve">3. Упражнение 1. «Четыре корзины»</w:t>
+        <w:t xml:space="preserve">3. Упражнение 1. «Найди дефект»</w:t>
       </w:r>
     </w:p>
     <w:p>
@@ -2216,7 +2216,7 @@
           <w:sz w:val="26"/>
           <w:szCs w:val="26"/>
         </w:rPr>
-        <w:t xml:space="preserve">научиться различать метод, приём, средство и форму организации обучения.</w:t>
+        <w:t xml:space="preserve">научиться находить дефекты в чужом коде и классифицировать их по типу (логическая ошибка, уязвимость, запах кода, стиль) и серьёзности (критическая, высокая, средняя, низкая).</w:t>
       </w:r>
     </w:p>
     <w:p>
@@ -2240,7 +2240,7 @@
           <w:sz w:val="26"/>
           <w:szCs w:val="26"/>
         </w:rPr>
-        <w:t xml:space="preserve">перед вами 12 карточек. Разложите их по четырём «корзинам»: метод, приём, средство, форма организации обучения. Работайте индивидуально 5 минут, затем сверьте результат с соседом и обсудите расхождения. Спорные карточки вынесите на общее обсуждение.</w:t>
+        <w:t xml:space="preserve">перед вами 6 фрагментов кода. Для каждого найдите проблему, укажите тип, серьёзность и предложите исправление в одном предложении. Работайте индивидуально 8 минут, затем сверьте ответы с соседом и обсудите расхождения. Спорные фрагменты вынесите на общее обсуждение.</w:t>
       </w:r>
     </w:p>
     <w:tbl>
@@ -2256,9 +2256,9 @@
         </w:tblBorders>
       </w:tblPr>
       <w:tblGrid>
-        <w:gridCol w:w="600"/>
-        <w:gridCol w:w="4500"/>
-        <w:gridCol w:w="4538"/>
+        <w:gridCol w:w="520"/>
+        <w:gridCol w:w="4300"/>
+        <w:gridCol w:w="4818"/>
       </w:tblGrid>
       <w:tr>
         <w:trPr>
@@ -2266,7 +2266,7 @@
         </w:trPr>
         <w:tc>
           <w:tcPr>
-            <w:tcW w:type="dxa" w:w="600"/>
+            <w:tcW w:type="dxa" w:w="520"/>
             <w:tcBorders>
               <w:top w:val="single" w:color="BFBFBF" w:sz="6"/>
               <w:left w:val="single" w:color="BFBFBF" w:sz="6"/>
@@ -2302,7 +2302,7 @@
         </w:tc>
         <w:tc>
           <w:tcPr>
-            <w:tcW w:type="dxa" w:w="4500"/>
+            <w:tcW w:type="dxa" w:w="4300"/>
             <w:tcBorders>
               <w:top w:val="single" w:color="BFBFBF" w:sz="6"/>
               <w:left w:val="single" w:color="BFBFBF" w:sz="6"/>
@@ -2332,13 +2332,13 @@
                 <w:sz w:val="22"/>
                 <w:szCs w:val="22"/>
               </w:rPr>
-              <w:t xml:space="preserve">Карточка</w:t>
-            </w:r>
-          </w:p>
-        </w:tc>
-        <w:tc>
-          <w:tcPr>
-            <w:tcW w:type="dxa" w:w="4538"/>
+              <w:t xml:space="preserve">Фрагмент (Python)</w:t>
+            </w:r>
+          </w:p>
+        </w:tc>
+        <w:tc>
+          <w:tcPr>
+            <w:tcW w:type="dxa" w:w="4818"/>
             <w:tcBorders>
               <w:top w:val="single" w:color="BFBFBF" w:sz="6"/>
               <w:left w:val="single" w:color="BFBFBF" w:sz="6"/>
@@ -2379,7 +2379,7 @@
         </w:trPr>
         <w:tc>
           <w:tcPr>
-            <w:tcW w:type="dxa" w:w="600"/>
+            <w:tcW w:type="dxa" w:w="520"/>
             <w:tcBorders>
               <w:top w:val="single" w:color="BFBFBF" w:sz="6"/>
               <w:left w:val="single" w:color="BFBFBF" w:sz="6"/>
@@ -2413,69 +2413,85 @@
         </w:tc>
         <w:tc>
           <w:tcPr>
-            <w:tcW w:type="dxa" w:w="4500"/>
-            <w:tcBorders>
-              <w:top w:val="single" w:color="BFBFBF" w:sz="6"/>
-              <w:left w:val="single" w:color="BFBFBF" w:sz="6"/>
-              <w:bottom w:val="single" w:color="BFBFBF" w:sz="6"/>
-              <w:right w:val="single" w:color="BFBFBF" w:sz="6"/>
-            </w:tcBorders>
-            <w:tcMar>
-              <w:top w:type="dxa" w:w="70"/>
-              <w:left w:type="dxa" w:w="110"/>
-              <w:bottom w:type="dxa" w:w="70"/>
-              <w:right w:type="dxa" w:w="110"/>
-            </w:tcMar>
-            <w:vAlign w:val="center"/>
-          </w:tcPr>
-          <w:p>
-            <w:pPr>
-              <w:spacing w:after="50" w:line="264"/>
-              <w:jc w:val="left"/>
-            </w:pPr>
-            <w:r>
-              <w:rPr>
-                <w:rFonts w:ascii="Times New Roman" w:cs="Times New Roman" w:eastAsia="Times New Roman" w:hAnsi="Times New Roman"/>
-                <w:b w:val="false"/>
-                <w:bCs w:val="false"/>
-                <w:sz w:val="22"/>
-                <w:szCs w:val="22"/>
-              </w:rPr>
-              <w:t xml:space="preserve">Проблемный вопрос в начале лекции</w:t>
-            </w:r>
-          </w:p>
-        </w:tc>
-        <w:tc>
-          <w:tcPr>
-            <w:tcW w:type="dxa" w:w="4538"/>
-            <w:tcBorders>
-              <w:top w:val="single" w:color="BFBFBF" w:sz="6"/>
-              <w:left w:val="single" w:color="BFBFBF" w:sz="6"/>
-              <w:bottom w:val="single" w:color="BFBFBF" w:sz="6"/>
-              <w:right w:val="single" w:color="BFBFBF" w:sz="6"/>
-            </w:tcBorders>
-            <w:tcMar>
-              <w:top w:type="dxa" w:w="70"/>
-              <w:left w:type="dxa" w:w="110"/>
-              <w:bottom w:type="dxa" w:w="70"/>
-              <w:right w:type="dxa" w:w="110"/>
-            </w:tcMar>
-            <w:vAlign w:val="center"/>
-          </w:tcPr>
-          <w:p>
-            <w:pPr>
-              <w:spacing w:after="50" w:line="264"/>
-              <w:jc w:val="left"/>
-            </w:pPr>
-            <w:r>
-              <w:rPr>
-                <w:rFonts w:ascii="Times New Roman" w:cs="Times New Roman" w:eastAsia="Times New Roman" w:hAnsi="Times New Roman"/>
-                <w:b w:val="false"/>
-                <w:bCs w:val="false"/>
-                <w:sz w:val="22"/>
-                <w:szCs w:val="22"/>
-              </w:rPr>
-              <w:t xml:space="preserve">Приём</w:t>
+            <w:tcW w:type="dxa" w:w="4300"/>
+            <w:tcBorders>
+              <w:top w:val="single" w:color="BFBFBF" w:sz="6"/>
+              <w:left w:val="single" w:color="BFBFBF" w:sz="6"/>
+              <w:bottom w:val="single" w:color="BFBFBF" w:sz="6"/>
+              <w:right w:val="single" w:color="BFBFBF" w:sz="6"/>
+            </w:tcBorders>
+            <w:tcMar>
+              <w:top w:type="dxa" w:w="70"/>
+              <w:left w:type="dxa" w:w="110"/>
+              <w:bottom w:type="dxa" w:w="70"/>
+              <w:right w:type="dxa" w:w="110"/>
+            </w:tcMar>
+            <w:vAlign w:val="top"/>
+          </w:tcPr>
+          <w:p>
+            <w:pPr>
+              <w:spacing w:after="0" w:line="264"/>
+              <w:jc w:val="left"/>
+            </w:pPr>
+            <w:r>
+              <w:rPr>
+                <w:rFonts w:ascii="Courier New" w:cs="Courier New" w:eastAsia="Courier New" w:hAnsi="Courier New"/>
+                <w:b w:val="false"/>
+                <w:bCs w:val="false"/>
+                <w:sz w:val="19"/>
+                <w:szCs w:val="19"/>
+              </w:rPr>
+              <w:t xml:space="preserve">def avg(xs):</w:t>
+            </w:r>
+          </w:p>
+          <w:p>
+            <w:pPr>
+              <w:spacing w:after="0" w:line="264"/>
+              <w:jc w:val="left"/>
+            </w:pPr>
+            <w:r>
+              <w:rPr>
+                <w:rFonts w:ascii="Courier New" w:cs="Courier New" w:eastAsia="Courier New" w:hAnsi="Courier New"/>
+                <w:b w:val="false"/>
+                <w:bCs w:val="false"/>
+                <w:sz w:val="19"/>
+                <w:szCs w:val="19"/>
+              </w:rPr>
+              <w:t xml:space="preserve">    return sum(xs) / len(xs)</w:t>
+            </w:r>
+          </w:p>
+        </w:tc>
+        <w:tc>
+          <w:tcPr>
+            <w:tcW w:type="dxa" w:w="4818"/>
+            <w:tcBorders>
+              <w:top w:val="single" w:color="BFBFBF" w:sz="6"/>
+              <w:left w:val="single" w:color="BFBFBF" w:sz="6"/>
+              <w:bottom w:val="single" w:color="BFBFBF" w:sz="6"/>
+              <w:right w:val="single" w:color="BFBFBF" w:sz="6"/>
+            </w:tcBorders>
+            <w:tcMar>
+              <w:top w:type="dxa" w:w="70"/>
+              <w:left w:type="dxa" w:w="110"/>
+              <w:bottom w:type="dxa" w:w="70"/>
+              <w:right w:type="dxa" w:w="110"/>
+            </w:tcMar>
+            <w:vAlign w:val="center"/>
+          </w:tcPr>
+          <w:p>
+            <w:pPr>
+              <w:spacing w:after="50" w:line="264"/>
+              <w:jc w:val="left"/>
+            </w:pPr>
+            <w:r>
+              <w:rPr>
+                <w:rFonts w:ascii="Times New Roman" w:cs="Times New Roman" w:eastAsia="Times New Roman" w:hAnsi="Times New Roman"/>
+                <w:b w:val="false"/>
+                <w:bCs w:val="false"/>
+                <w:sz w:val="22"/>
+                <w:szCs w:val="22"/>
+              </w:rPr>
+              <w:t xml:space="preserve">Логическая ошибка: деление на ноль при пустом списке. Серьёзность: высокая. Исправление: проверка на пустой список или возврат None</w:t>
             </w:r>
           </w:p>
         </w:tc>
@@ -2486,7 +2502,7 @@
         </w:trPr>
         <w:tc>
           <w:tcPr>
-            <w:tcW w:type="dxa" w:w="600"/>
+            <w:tcW w:type="dxa" w:w="520"/>
             <w:tcBorders>
               <w:top w:val="single" w:color="BFBFBF" w:sz="6"/>
               <w:left w:val="single" w:color="BFBFBF" w:sz="6"/>
@@ -2521,7 +2537,7 @@
         </w:tc>
         <w:tc>
           <w:tcPr>
-            <w:tcW w:type="dxa" w:w="4500"/>
+            <w:tcW w:type="dxa" w:w="4300"/>
             <w:tcBorders>
               <w:top w:val="single" w:color="BFBFBF" w:sz="6"/>
               <w:left w:val="single" w:color="BFBFBF" w:sz="6"/>
@@ -2535,28 +2551,60 @@
               <w:bottom w:type="dxa" w:w="70"/>
               <w:right w:type="dxa" w:w="110"/>
             </w:tcMar>
-            <w:vAlign w:val="center"/>
-          </w:tcPr>
-          <w:p>
-            <w:pPr>
-              <w:spacing w:after="50" w:line="264"/>
-              <w:jc w:val="left"/>
-            </w:pPr>
-            <w:r>
-              <w:rPr>
-                <w:rFonts w:ascii="Times New Roman" w:cs="Times New Roman" w:eastAsia="Times New Roman" w:hAnsi="Times New Roman"/>
-                <w:b w:val="false"/>
-                <w:bCs w:val="false"/>
-                <w:sz w:val="22"/>
-                <w:szCs w:val="22"/>
-              </w:rPr>
-              <w:t xml:space="preserve">Лабораторное занятие</w:t>
-            </w:r>
-          </w:p>
-        </w:tc>
-        <w:tc>
-          <w:tcPr>
-            <w:tcW w:type="dxa" w:w="4538"/>
+            <w:vAlign w:val="top"/>
+          </w:tcPr>
+          <w:p>
+            <w:pPr>
+              <w:spacing w:after="0" w:line="264"/>
+              <w:jc w:val="left"/>
+            </w:pPr>
+            <w:r>
+              <w:rPr>
+                <w:rFonts w:ascii="Courier New" w:cs="Courier New" w:eastAsia="Courier New" w:hAnsi="Courier New"/>
+                <w:b w:val="false"/>
+                <w:bCs w:val="false"/>
+                <w:sz w:val="19"/>
+                <w:szCs w:val="19"/>
+              </w:rPr>
+              <w:t xml:space="preserve">query = "SELECT * FROM users</w:t>
+            </w:r>
+          </w:p>
+          <w:p>
+            <w:pPr>
+              <w:spacing w:after="0" w:line="264"/>
+              <w:jc w:val="left"/>
+            </w:pPr>
+            <w:r>
+              <w:rPr>
+                <w:rFonts w:ascii="Courier New" w:cs="Courier New" w:eastAsia="Courier New" w:hAnsi="Courier New"/>
+                <w:b w:val="false"/>
+                <w:bCs w:val="false"/>
+                <w:sz w:val="19"/>
+                <w:szCs w:val="19"/>
+              </w:rPr>
+              <w:t xml:space="preserve">  WHERE name = '" + name + "'"</w:t>
+            </w:r>
+          </w:p>
+          <w:p>
+            <w:pPr>
+              <w:spacing w:after="0" w:line="264"/>
+              <w:jc w:val="left"/>
+            </w:pPr>
+            <w:r>
+              <w:rPr>
+                <w:rFonts w:ascii="Courier New" w:cs="Courier New" w:eastAsia="Courier New" w:hAnsi="Courier New"/>
+                <w:b w:val="false"/>
+                <w:bCs w:val="false"/>
+                <w:sz w:val="19"/>
+                <w:szCs w:val="19"/>
+              </w:rPr>
+              <w:t xml:space="preserve">cursor.execute(query)</w:t>
+            </w:r>
+          </w:p>
+        </w:tc>
+        <w:tc>
+          <w:tcPr>
+            <w:tcW w:type="dxa" w:w="4818"/>
             <w:tcBorders>
               <w:top w:val="single" w:color="BFBFBF" w:sz="6"/>
               <w:left w:val="single" w:color="BFBFBF" w:sz="6"/>
@@ -2585,7 +2633,7 @@
                 <w:sz w:val="22"/>
                 <w:szCs w:val="22"/>
               </w:rPr>
-              <w:t xml:space="preserve">Форма организации обучения</w:t>
+              <w:t xml:space="preserve">Уязвимость: SQL-инъекция через конкатенацию строк. Серьёзность: критическая. Исправление: параметризованный запрос</w:t>
             </w:r>
           </w:p>
         </w:tc>
@@ -2596,7 +2644,7 @@
         </w:trPr>
         <w:tc>
           <w:tcPr>
-            <w:tcW w:type="dxa" w:w="600"/>
+            <w:tcW w:type="dxa" w:w="520"/>
             <w:tcBorders>
               <w:top w:val="single" w:color="BFBFBF" w:sz="6"/>
               <w:left w:val="single" w:color="BFBFBF" w:sz="6"/>
@@ -2630,69 +2678,101 @@
         </w:tc>
         <w:tc>
           <w:tcPr>
-            <w:tcW w:type="dxa" w:w="4500"/>
-            <w:tcBorders>
-              <w:top w:val="single" w:color="BFBFBF" w:sz="6"/>
-              <w:left w:val="single" w:color="BFBFBF" w:sz="6"/>
-              <w:bottom w:val="single" w:color="BFBFBF" w:sz="6"/>
-              <w:right w:val="single" w:color="BFBFBF" w:sz="6"/>
-            </w:tcBorders>
-            <w:tcMar>
-              <w:top w:type="dxa" w:w="70"/>
-              <w:left w:type="dxa" w:w="110"/>
-              <w:bottom w:type="dxa" w:w="70"/>
-              <w:right w:type="dxa" w:w="110"/>
-            </w:tcMar>
-            <w:vAlign w:val="center"/>
-          </w:tcPr>
-          <w:p>
-            <w:pPr>
-              <w:spacing w:after="50" w:line="264"/>
-              <w:jc w:val="left"/>
-            </w:pPr>
-            <w:r>
-              <w:rPr>
-                <w:rFonts w:ascii="Times New Roman" w:cs="Times New Roman" w:eastAsia="Times New Roman" w:hAnsi="Times New Roman"/>
-                <w:b w:val="false"/>
-                <w:bCs w:val="false"/>
-                <w:sz w:val="22"/>
-                <w:szCs w:val="22"/>
-              </w:rPr>
-              <w:t xml:space="preserve">Кейс-стади</w:t>
-            </w:r>
-          </w:p>
-        </w:tc>
-        <w:tc>
-          <w:tcPr>
-            <w:tcW w:type="dxa" w:w="4538"/>
-            <w:tcBorders>
-              <w:top w:val="single" w:color="BFBFBF" w:sz="6"/>
-              <w:left w:val="single" w:color="BFBFBF" w:sz="6"/>
-              <w:bottom w:val="single" w:color="BFBFBF" w:sz="6"/>
-              <w:right w:val="single" w:color="BFBFBF" w:sz="6"/>
-            </w:tcBorders>
-            <w:tcMar>
-              <w:top w:type="dxa" w:w="70"/>
-              <w:left w:type="dxa" w:w="110"/>
-              <w:bottom w:type="dxa" w:w="70"/>
-              <w:right w:type="dxa" w:w="110"/>
-            </w:tcMar>
-            <w:vAlign w:val="center"/>
-          </w:tcPr>
-          <w:p>
-            <w:pPr>
-              <w:spacing w:after="50" w:line="264"/>
-              <w:jc w:val="left"/>
-            </w:pPr>
-            <w:r>
-              <w:rPr>
-                <w:rFonts w:ascii="Times New Roman" w:cs="Times New Roman" w:eastAsia="Times New Roman" w:hAnsi="Times New Roman"/>
-                <w:b w:val="false"/>
-                <w:bCs w:val="false"/>
-                <w:sz w:val="22"/>
-                <w:szCs w:val="22"/>
-              </w:rPr>
-              <w:t xml:space="preserve">Метод (активный)</w:t>
+            <w:tcW w:type="dxa" w:w="4300"/>
+            <w:tcBorders>
+              <w:top w:val="single" w:color="BFBFBF" w:sz="6"/>
+              <w:left w:val="single" w:color="BFBFBF" w:sz="6"/>
+              <w:bottom w:val="single" w:color="BFBFBF" w:sz="6"/>
+              <w:right w:val="single" w:color="BFBFBF" w:sz="6"/>
+            </w:tcBorders>
+            <w:tcMar>
+              <w:top w:type="dxa" w:w="70"/>
+              <w:left w:type="dxa" w:w="110"/>
+              <w:bottom w:type="dxa" w:w="70"/>
+              <w:right w:type="dxa" w:w="110"/>
+            </w:tcMar>
+            <w:vAlign w:val="top"/>
+          </w:tcPr>
+          <w:p>
+            <w:pPr>
+              <w:spacing w:after="0" w:line="264"/>
+              <w:jc w:val="left"/>
+            </w:pPr>
+            <w:r>
+              <w:rPr>
+                <w:rFonts w:ascii="Courier New" w:cs="Courier New" w:eastAsia="Courier New" w:hAnsi="Courier New"/>
+                <w:b w:val="false"/>
+                <w:bCs w:val="false"/>
+                <w:sz w:val="19"/>
+                <w:szCs w:val="19"/>
+              </w:rPr>
+              <w:t xml:space="preserve">def process(d):</w:t>
+            </w:r>
+          </w:p>
+          <w:p>
+            <w:pPr>
+              <w:spacing w:after="0" w:line="264"/>
+              <w:jc w:val="left"/>
+            </w:pPr>
+            <w:r>
+              <w:rPr>
+                <w:rFonts w:ascii="Courier New" w:cs="Courier New" w:eastAsia="Courier New" w:hAnsi="Courier New"/>
+                <w:b w:val="false"/>
+                <w:bCs w:val="false"/>
+                <w:sz w:val="19"/>
+                <w:szCs w:val="19"/>
+              </w:rPr>
+              <w:t xml:space="preserve">    # ... 180 строк ...</w:t>
+            </w:r>
+          </w:p>
+          <w:p>
+            <w:pPr>
+              <w:spacing w:after="0" w:line="264"/>
+              <w:jc w:val="left"/>
+            </w:pPr>
+            <w:r>
+              <w:rPr>
+                <w:rFonts w:ascii="Courier New" w:cs="Courier New" w:eastAsia="Courier New" w:hAnsi="Courier New"/>
+                <w:b w:val="false"/>
+                <w:bCs w:val="false"/>
+                <w:sz w:val="19"/>
+                <w:szCs w:val="19"/>
+              </w:rPr>
+              <w:t xml:space="preserve">    return result</w:t>
+            </w:r>
+          </w:p>
+        </w:tc>
+        <w:tc>
+          <w:tcPr>
+            <w:tcW w:type="dxa" w:w="4818"/>
+            <w:tcBorders>
+              <w:top w:val="single" w:color="BFBFBF" w:sz="6"/>
+              <w:left w:val="single" w:color="BFBFBF" w:sz="6"/>
+              <w:bottom w:val="single" w:color="BFBFBF" w:sz="6"/>
+              <w:right w:val="single" w:color="BFBFBF" w:sz="6"/>
+            </w:tcBorders>
+            <w:tcMar>
+              <w:top w:type="dxa" w:w="70"/>
+              <w:left w:type="dxa" w:w="110"/>
+              <w:bottom w:type="dxa" w:w="70"/>
+              <w:right w:type="dxa" w:w="110"/>
+            </w:tcMar>
+            <w:vAlign w:val="center"/>
+          </w:tcPr>
+          <w:p>
+            <w:pPr>
+              <w:spacing w:after="50" w:line="264"/>
+              <w:jc w:val="left"/>
+            </w:pPr>
+            <w:r>
+              <w:rPr>
+                <w:rFonts w:ascii="Times New Roman" w:cs="Times New Roman" w:eastAsia="Times New Roman" w:hAnsi="Times New Roman"/>
+                <w:b w:val="false"/>
+                <w:bCs w:val="false"/>
+                <w:sz w:val="22"/>
+                <w:szCs w:val="22"/>
+              </w:rPr>
+              <w:t xml:space="preserve">Запах кода: слишком длинная функция, неинформативные имена d и process. Серьёзность: средняя. Исправление: декомпозиция, осмысленные имена</w:t>
             </w:r>
           </w:p>
         </w:tc>
@@ -2703,7 +2783,7 @@
         </w:trPr>
         <w:tc>
           <w:tcPr>
-            <w:tcW w:type="dxa" w:w="600"/>
+            <w:tcW w:type="dxa" w:w="520"/>
             <w:tcBorders>
               <w:top w:val="single" w:color="BFBFBF" w:sz="6"/>
               <w:left w:val="single" w:color="BFBFBF" w:sz="6"/>
@@ -2738,7 +2818,7 @@
         </w:tc>
         <w:tc>
           <w:tcPr>
-            <w:tcW w:type="dxa" w:w="4500"/>
+            <w:tcW w:type="dxa" w:w="4300"/>
             <w:tcBorders>
               <w:top w:val="single" w:color="BFBFBF" w:sz="6"/>
               <w:left w:val="single" w:color="BFBFBF" w:sz="6"/>
@@ -2752,28 +2832,60 @@
               <w:bottom w:type="dxa" w:w="70"/>
               <w:right w:type="dxa" w:w="110"/>
             </w:tcMar>
-            <w:vAlign w:val="center"/>
-          </w:tcPr>
-          <w:p>
-            <w:pPr>
-              <w:spacing w:after="50" w:line="264"/>
-              <w:jc w:val="left"/>
-            </w:pPr>
-            <w:r>
-              <w:rPr>
-                <w:rFonts w:ascii="Times New Roman" w:cs="Times New Roman" w:eastAsia="Times New Roman" w:hAnsi="Times New Roman"/>
-                <w:b w:val="false"/>
-                <w:bCs w:val="false"/>
-                <w:sz w:val="22"/>
-                <w:szCs w:val="22"/>
-              </w:rPr>
-              <w:t xml:space="preserve">Презентация со слайдами</w:t>
-            </w:r>
-          </w:p>
-        </w:tc>
-        <w:tc>
-          <w:tcPr>
-            <w:tcW w:type="dxa" w:w="4538"/>
+            <w:vAlign w:val="top"/>
+          </w:tcPr>
+          <w:p>
+            <w:pPr>
+              <w:spacing w:after="0" w:line="264"/>
+              <w:jc w:val="left"/>
+            </w:pPr>
+            <w:r>
+              <w:rPr>
+                <w:rFonts w:ascii="Courier New" w:cs="Courier New" w:eastAsia="Courier New" w:hAnsi="Courier New"/>
+                <w:b w:val="false"/>
+                <w:bCs w:val="false"/>
+                <w:sz w:val="19"/>
+                <w:szCs w:val="19"/>
+              </w:rPr>
+              <w:t xml:space="preserve">TIMEOUT = 30</w:t>
+            </w:r>
+          </w:p>
+          <w:p>
+            <w:pPr>
+              <w:spacing w:after="0" w:line="264"/>
+              <w:jc w:val="left"/>
+            </w:pPr>
+            <w:r>
+              <w:rPr>
+                <w:rFonts w:ascii="Courier New" w:cs="Courier New" w:eastAsia="Courier New" w:hAnsi="Courier New"/>
+                <w:b w:val="false"/>
+                <w:bCs w:val="false"/>
+                <w:sz w:val="19"/>
+                <w:szCs w:val="19"/>
+              </w:rPr>
+              <w:t xml:space="preserve">time.sleep(30)</w:t>
+            </w:r>
+          </w:p>
+          <w:p>
+            <w:pPr>
+              <w:spacing w:after="0" w:line="264"/>
+              <w:jc w:val="left"/>
+            </w:pPr>
+            <w:r>
+              <w:rPr>
+                <w:rFonts w:ascii="Courier New" w:cs="Courier New" w:eastAsia="Courier New" w:hAnsi="Courier New"/>
+                <w:b w:val="false"/>
+                <w:bCs w:val="false"/>
+                <w:sz w:val="19"/>
+                <w:szCs w:val="19"/>
+              </w:rPr>
+              <w:t xml:space="preserve">retry(limit=30)</w:t>
+            </w:r>
+          </w:p>
+        </w:tc>
+        <w:tc>
+          <w:tcPr>
+            <w:tcW w:type="dxa" w:w="4818"/>
             <w:tcBorders>
               <w:top w:val="single" w:color="BFBFBF" w:sz="6"/>
               <w:left w:val="single" w:color="BFBFBF" w:sz="6"/>
@@ -2802,7 +2914,7 @@
                 <w:sz w:val="22"/>
                 <w:szCs w:val="22"/>
               </w:rPr>
-              <w:t xml:space="preserve">Средство</w:t>
+              <w:t xml:space="preserve">Запах кода: «магические числа», константа объявлена, но не используется. Серьёзность: низкая. Исправление: использовать TIMEOUT, вынести лимит повторов в отдельную константу</w:t>
             </w:r>
           </w:p>
         </w:tc>
@@ -2813,7 +2925,7 @@
         </w:trPr>
         <w:tc>
           <w:tcPr>
-            <w:tcW w:type="dxa" w:w="600"/>
+            <w:tcW w:type="dxa" w:w="520"/>
             <w:tcBorders>
               <w:top w:val="single" w:color="BFBFBF" w:sz="6"/>
               <w:left w:val="single" w:color="BFBFBF" w:sz="6"/>
@@ -2847,69 +2959,117 @@
         </w:tc>
         <w:tc>
           <w:tcPr>
-            <w:tcW w:type="dxa" w:w="4500"/>
-            <w:tcBorders>
-              <w:top w:val="single" w:color="BFBFBF" w:sz="6"/>
-              <w:left w:val="single" w:color="BFBFBF" w:sz="6"/>
-              <w:bottom w:val="single" w:color="BFBFBF" w:sz="6"/>
-              <w:right w:val="single" w:color="BFBFBF" w:sz="6"/>
-            </w:tcBorders>
-            <w:tcMar>
-              <w:top w:type="dxa" w:w="70"/>
-              <w:left w:type="dxa" w:w="110"/>
-              <w:bottom w:type="dxa" w:w="70"/>
-              <w:right w:type="dxa" w:w="110"/>
-            </w:tcMar>
-            <w:vAlign w:val="center"/>
-          </w:tcPr>
-          <w:p>
-            <w:pPr>
-              <w:spacing w:after="50" w:line="264"/>
-              <w:jc w:val="left"/>
-            </w:pPr>
-            <w:r>
-              <w:rPr>
-                <w:rFonts w:ascii="Times New Roman" w:cs="Times New Roman" w:eastAsia="Times New Roman" w:hAnsi="Times New Roman"/>
-                <w:b w:val="false"/>
-                <w:bCs w:val="false"/>
-                <w:sz w:val="22"/>
-                <w:szCs w:val="22"/>
-              </w:rPr>
-              <w:t xml:space="preserve">Объяснительно-иллюстративный метод</w:t>
-            </w:r>
-          </w:p>
-        </w:tc>
-        <w:tc>
-          <w:tcPr>
-            <w:tcW w:type="dxa" w:w="4538"/>
-            <w:tcBorders>
-              <w:top w:val="single" w:color="BFBFBF" w:sz="6"/>
-              <w:left w:val="single" w:color="BFBFBF" w:sz="6"/>
-              <w:bottom w:val="single" w:color="BFBFBF" w:sz="6"/>
-              <w:right w:val="single" w:color="BFBFBF" w:sz="6"/>
-            </w:tcBorders>
-            <w:tcMar>
-              <w:top w:type="dxa" w:w="70"/>
-              <w:left w:type="dxa" w:w="110"/>
-              <w:bottom w:type="dxa" w:w="70"/>
-              <w:right w:type="dxa" w:w="110"/>
-            </w:tcMar>
-            <w:vAlign w:val="center"/>
-          </w:tcPr>
-          <w:p>
-            <w:pPr>
-              <w:spacing w:after="50" w:line="264"/>
-              <w:jc w:val="left"/>
-            </w:pPr>
-            <w:r>
-              <w:rPr>
-                <w:rFonts w:ascii="Times New Roman" w:cs="Times New Roman" w:eastAsia="Times New Roman" w:hAnsi="Times New Roman"/>
-                <w:b w:val="false"/>
-                <w:bCs w:val="false"/>
-                <w:sz w:val="22"/>
-                <w:szCs w:val="22"/>
-              </w:rPr>
-              <w:t xml:space="preserve">Метод (традиционный)</w:t>
+            <w:tcW w:type="dxa" w:w="4300"/>
+            <w:tcBorders>
+              <w:top w:val="single" w:color="BFBFBF" w:sz="6"/>
+              <w:left w:val="single" w:color="BFBFBF" w:sz="6"/>
+              <w:bottom w:val="single" w:color="BFBFBF" w:sz="6"/>
+              <w:right w:val="single" w:color="BFBFBF" w:sz="6"/>
+            </w:tcBorders>
+            <w:tcMar>
+              <w:top w:type="dxa" w:w="70"/>
+              <w:left w:type="dxa" w:w="110"/>
+              <w:bottom w:type="dxa" w:w="70"/>
+              <w:right w:type="dxa" w:w="110"/>
+            </w:tcMar>
+            <w:vAlign w:val="top"/>
+          </w:tcPr>
+          <w:p>
+            <w:pPr>
+              <w:spacing w:after="0" w:line="264"/>
+              <w:jc w:val="left"/>
+            </w:pPr>
+            <w:r>
+              <w:rPr>
+                <w:rFonts w:ascii="Courier New" w:cs="Courier New" w:eastAsia="Courier New" w:hAnsi="Courier New"/>
+                <w:b w:val="false"/>
+                <w:bCs w:val="false"/>
+                <w:sz w:val="19"/>
+                <w:szCs w:val="19"/>
+              </w:rPr>
+              <w:t xml:space="preserve">try:</w:t>
+            </w:r>
+          </w:p>
+          <w:p>
+            <w:pPr>
+              <w:spacing w:after="0" w:line="264"/>
+              <w:jc w:val="left"/>
+            </w:pPr>
+            <w:r>
+              <w:rPr>
+                <w:rFonts w:ascii="Courier New" w:cs="Courier New" w:eastAsia="Courier New" w:hAnsi="Courier New"/>
+                <w:b w:val="false"/>
+                <w:bCs w:val="false"/>
+                <w:sz w:val="19"/>
+                <w:szCs w:val="19"/>
+              </w:rPr>
+              <w:t xml:space="preserve">    save(order)</w:t>
+            </w:r>
+          </w:p>
+          <w:p>
+            <w:pPr>
+              <w:spacing w:after="0" w:line="264"/>
+              <w:jc w:val="left"/>
+            </w:pPr>
+            <w:r>
+              <w:rPr>
+                <w:rFonts w:ascii="Courier New" w:cs="Courier New" w:eastAsia="Courier New" w:hAnsi="Courier New"/>
+                <w:b w:val="false"/>
+                <w:bCs w:val="false"/>
+                <w:sz w:val="19"/>
+                <w:szCs w:val="19"/>
+              </w:rPr>
+              <w:t xml:space="preserve">except Exception:</w:t>
+            </w:r>
+          </w:p>
+          <w:p>
+            <w:pPr>
+              <w:spacing w:after="0" w:line="264"/>
+              <w:jc w:val="left"/>
+            </w:pPr>
+            <w:r>
+              <w:rPr>
+                <w:rFonts w:ascii="Courier New" w:cs="Courier New" w:eastAsia="Courier New" w:hAnsi="Courier New"/>
+                <w:b w:val="false"/>
+                <w:bCs w:val="false"/>
+                <w:sz w:val="19"/>
+                <w:szCs w:val="19"/>
+              </w:rPr>
+              <w:t xml:space="preserve">    pass</w:t>
+            </w:r>
+          </w:p>
+        </w:tc>
+        <w:tc>
+          <w:tcPr>
+            <w:tcW w:type="dxa" w:w="4818"/>
+            <w:tcBorders>
+              <w:top w:val="single" w:color="BFBFBF" w:sz="6"/>
+              <w:left w:val="single" w:color="BFBFBF" w:sz="6"/>
+              <w:bottom w:val="single" w:color="BFBFBF" w:sz="6"/>
+              <w:right w:val="single" w:color="BFBFBF" w:sz="6"/>
+            </w:tcBorders>
+            <w:tcMar>
+              <w:top w:type="dxa" w:w="70"/>
+              <w:left w:type="dxa" w:w="110"/>
+              <w:bottom w:type="dxa" w:w="70"/>
+              <w:right w:type="dxa" w:w="110"/>
+            </w:tcMar>
+            <w:vAlign w:val="center"/>
+          </w:tcPr>
+          <w:p>
+            <w:pPr>
+              <w:spacing w:after="50" w:line="264"/>
+              <w:jc w:val="left"/>
+            </w:pPr>
+            <w:r>
+              <w:rPr>
+                <w:rFonts w:ascii="Times New Roman" w:cs="Times New Roman" w:eastAsia="Times New Roman" w:hAnsi="Times New Roman"/>
+                <w:b w:val="false"/>
+                <w:bCs w:val="false"/>
+                <w:sz w:val="22"/>
+                <w:szCs w:val="22"/>
+              </w:rPr>
+              <w:t xml:space="preserve">Логическая ошибка и запах: проглоченное исключение, потеря данных без следа. Серьёзность: высокая. Исправление: логирование и обработка конкретных исключений</w:t>
             </w:r>
           </w:p>
         </w:tc>
@@ -2920,7 +3080,7 @@
         </w:trPr>
         <w:tc>
           <w:tcPr>
-            <w:tcW w:type="dxa" w:w="600"/>
+            <w:tcW w:type="dxa" w:w="520"/>
             <w:tcBorders>
               <w:top w:val="single" w:color="BFBFBF" w:sz="6"/>
               <w:left w:val="single" w:color="BFBFBF" w:sz="6"/>
@@ -2955,7 +3115,7 @@
         </w:tc>
         <w:tc>
           <w:tcPr>
-            <w:tcW w:type="dxa" w:w="4500"/>
+            <w:tcW w:type="dxa" w:w="4300"/>
             <w:tcBorders>
               <w:top w:val="single" w:color="BFBFBF" w:sz="6"/>
               <w:left w:val="single" w:color="BFBFBF" w:sz="6"/>
@@ -2969,28 +3129,76 @@
               <w:bottom w:type="dxa" w:w="70"/>
               <w:right w:type="dxa" w:w="110"/>
             </w:tcMar>
-            <w:vAlign w:val="center"/>
-          </w:tcPr>
-          <w:p>
-            <w:pPr>
-              <w:spacing w:after="50" w:line="264"/>
-              <w:jc w:val="left"/>
-            </w:pPr>
-            <w:r>
-              <w:rPr>
-                <w:rFonts w:ascii="Times New Roman" w:cs="Times New Roman" w:eastAsia="Times New Roman" w:hAnsi="Times New Roman"/>
-                <w:b w:val="false"/>
-                <w:bCs w:val="false"/>
-                <w:sz w:val="22"/>
-                <w:szCs w:val="22"/>
-              </w:rPr>
-              <w:t xml:space="preserve">Семинар</w:t>
-            </w:r>
-          </w:p>
-        </w:tc>
-        <w:tc>
-          <w:tcPr>
-            <w:tcW w:type="dxa" w:w="4538"/>
+            <w:vAlign w:val="top"/>
+          </w:tcPr>
+          <w:p>
+            <w:pPr>
+              <w:spacing w:after="0" w:line="264"/>
+              <w:jc w:val="left"/>
+            </w:pPr>
+            <w:r>
+              <w:rPr>
+                <w:rFonts w:ascii="Courier New" w:cs="Courier New" w:eastAsia="Courier New" w:hAnsi="Courier New"/>
+                <w:b w:val="false"/>
+                <w:bCs w:val="false"/>
+                <w:sz w:val="19"/>
+                <w:szCs w:val="19"/>
+              </w:rPr>
+              <w:t xml:space="preserve">if user.is_admin == True:</w:t>
+            </w:r>
+          </w:p>
+          <w:p>
+            <w:pPr>
+              <w:spacing w:after="0" w:line="264"/>
+              <w:jc w:val="left"/>
+            </w:pPr>
+            <w:r>
+              <w:rPr>
+                <w:rFonts w:ascii="Courier New" w:cs="Courier New" w:eastAsia="Courier New" w:hAnsi="Courier New"/>
+                <w:b w:val="false"/>
+                <w:bCs w:val="false"/>
+                <w:sz w:val="19"/>
+                <w:szCs w:val="19"/>
+              </w:rPr>
+              <w:t xml:space="preserve">    grant_all(user)</w:t>
+            </w:r>
+          </w:p>
+          <w:p>
+            <w:pPr>
+              <w:spacing w:after="0" w:line="264"/>
+              <w:jc w:val="left"/>
+            </w:pPr>
+            <w:r>
+              <w:rPr>
+                <w:rFonts w:ascii="Courier New" w:cs="Courier New" w:eastAsia="Courier New" w:hAnsi="Courier New"/>
+                <w:b w:val="false"/>
+                <w:bCs w:val="false"/>
+                <w:sz w:val="19"/>
+                <w:szCs w:val="19"/>
+              </w:rPr>
+              <w:t xml:space="preserve">elif user.is_admin == False:</w:t>
+            </w:r>
+          </w:p>
+          <w:p>
+            <w:pPr>
+              <w:spacing w:after="0" w:line="264"/>
+              <w:jc w:val="left"/>
+            </w:pPr>
+            <w:r>
+              <w:rPr>
+                <w:rFonts w:ascii="Courier New" w:cs="Courier New" w:eastAsia="Courier New" w:hAnsi="Courier New"/>
+                <w:b w:val="false"/>
+                <w:bCs w:val="false"/>
+                <w:sz w:val="19"/>
+                <w:szCs w:val="19"/>
+              </w:rPr>
+              <w:t xml:space="preserve">    grant_all(user)</w:t>
+            </w:r>
+          </w:p>
+        </w:tc>
+        <w:tc>
+          <w:tcPr>
+            <w:tcW w:type="dxa" w:w="4818"/>
             <w:tcBorders>
               <w:top w:val="single" w:color="BFBFBF" w:sz="6"/>
               <w:left w:val="single" w:color="BFBFBF" w:sz="6"/>
@@ -3019,658 +3227,7 @@
                 <w:sz w:val="22"/>
                 <w:szCs w:val="22"/>
               </w:rPr>
-              <w:t xml:space="preserve">Форма организации обучения</w:t>
-            </w:r>
-          </w:p>
-        </w:tc>
-      </w:tr>
-      <w:tr>
-        <w:trPr>
-          <w:cantSplit/>
-        </w:trPr>
-        <w:tc>
-          <w:tcPr>
-            <w:tcW w:type="dxa" w:w="600"/>
-            <w:tcBorders>
-              <w:top w:val="single" w:color="BFBFBF" w:sz="6"/>
-              <w:left w:val="single" w:color="BFBFBF" w:sz="6"/>
-              <w:bottom w:val="single" w:color="BFBFBF" w:sz="6"/>
-              <w:right w:val="single" w:color="BFBFBF" w:sz="6"/>
-            </w:tcBorders>
-            <w:tcMar>
-              <w:top w:type="dxa" w:w="70"/>
-              <w:left w:type="dxa" w:w="110"/>
-              <w:bottom w:type="dxa" w:w="70"/>
-              <w:right w:type="dxa" w:w="110"/>
-            </w:tcMar>
-            <w:vAlign w:val="center"/>
-          </w:tcPr>
-          <w:p>
-            <w:pPr>
-              <w:spacing w:after="50" w:line="264"/>
-              <w:jc w:val="left"/>
-            </w:pPr>
-            <w:r>
-              <w:rPr>
-                <w:rFonts w:ascii="Times New Roman" w:cs="Times New Roman" w:eastAsia="Times New Roman" w:hAnsi="Times New Roman"/>
-                <w:b/>
-                <w:bCs/>
-                <w:sz w:val="22"/>
-                <w:szCs w:val="22"/>
-              </w:rPr>
-              <w:t xml:space="preserve">7</w:t>
-            </w:r>
-          </w:p>
-        </w:tc>
-        <w:tc>
-          <w:tcPr>
-            <w:tcW w:type="dxa" w:w="4500"/>
-            <w:tcBorders>
-              <w:top w:val="single" w:color="BFBFBF" w:sz="6"/>
-              <w:left w:val="single" w:color="BFBFBF" w:sz="6"/>
-              <w:bottom w:val="single" w:color="BFBFBF" w:sz="6"/>
-              <w:right w:val="single" w:color="BFBFBF" w:sz="6"/>
-            </w:tcBorders>
-            <w:tcMar>
-              <w:top w:type="dxa" w:w="70"/>
-              <w:left w:type="dxa" w:w="110"/>
-              <w:bottom w:type="dxa" w:w="70"/>
-              <w:right w:type="dxa" w:w="110"/>
-            </w:tcMar>
-            <w:vAlign w:val="center"/>
-          </w:tcPr>
-          <w:p>
-            <w:pPr>
-              <w:spacing w:after="50" w:line="264"/>
-              <w:jc w:val="left"/>
-            </w:pPr>
-            <w:r>
-              <w:rPr>
-                <w:rFonts w:ascii="Times New Roman" w:cs="Times New Roman" w:eastAsia="Times New Roman" w:hAnsi="Times New Roman"/>
-                <w:b w:val="false"/>
-                <w:bCs w:val="false"/>
-                <w:sz w:val="22"/>
-                <w:szCs w:val="22"/>
-              </w:rPr>
-              <w:t xml:space="preserve">Чек-лист для самопроверки</w:t>
-            </w:r>
-          </w:p>
-        </w:tc>
-        <w:tc>
-          <w:tcPr>
-            <w:tcW w:type="dxa" w:w="4538"/>
-            <w:tcBorders>
-              <w:top w:val="single" w:color="BFBFBF" w:sz="6"/>
-              <w:left w:val="single" w:color="BFBFBF" w:sz="6"/>
-              <w:bottom w:val="single" w:color="BFBFBF" w:sz="6"/>
-              <w:right w:val="single" w:color="BFBFBF" w:sz="6"/>
-            </w:tcBorders>
-            <w:tcMar>
-              <w:top w:type="dxa" w:w="70"/>
-              <w:left w:type="dxa" w:w="110"/>
-              <w:bottom w:type="dxa" w:w="70"/>
-              <w:right w:type="dxa" w:w="110"/>
-            </w:tcMar>
-            <w:vAlign w:val="center"/>
-          </w:tcPr>
-          <w:p>
-            <w:pPr>
-              <w:spacing w:after="50" w:line="264"/>
-              <w:jc w:val="left"/>
-            </w:pPr>
-            <w:r>
-              <w:rPr>
-                <w:rFonts w:ascii="Times New Roman" w:cs="Times New Roman" w:eastAsia="Times New Roman" w:hAnsi="Times New Roman"/>
-                <w:b w:val="false"/>
-                <w:bCs w:val="false"/>
-                <w:sz w:val="22"/>
-                <w:szCs w:val="22"/>
-              </w:rPr>
-              <w:t xml:space="preserve">Приём (может рассматриваться и как средство)</w:t>
-            </w:r>
-          </w:p>
-        </w:tc>
-      </w:tr>
-      <w:tr>
-        <w:trPr>
-          <w:cantSplit/>
-        </w:trPr>
-        <w:tc>
-          <w:tcPr>
-            <w:tcW w:type="dxa" w:w="600"/>
-            <w:tcBorders>
-              <w:top w:val="single" w:color="BFBFBF" w:sz="6"/>
-              <w:left w:val="single" w:color="BFBFBF" w:sz="6"/>
-              <w:bottom w:val="single" w:color="BFBFBF" w:sz="6"/>
-              <w:right w:val="single" w:color="BFBFBF" w:sz="6"/>
-            </w:tcBorders>
-            <w:shd w:fill="F2EFE6" w:color="auto" w:val="clear"/>
-            <w:tcMar>
-              <w:top w:type="dxa" w:w="70"/>
-              <w:left w:type="dxa" w:w="110"/>
-              <w:bottom w:type="dxa" w:w="70"/>
-              <w:right w:type="dxa" w:w="110"/>
-            </w:tcMar>
-            <w:vAlign w:val="center"/>
-          </w:tcPr>
-          <w:p>
-            <w:pPr>
-              <w:spacing w:after="50" w:line="264"/>
-              <w:jc w:val="left"/>
-            </w:pPr>
-            <w:r>
-              <w:rPr>
-                <w:rFonts w:ascii="Times New Roman" w:cs="Times New Roman" w:eastAsia="Times New Roman" w:hAnsi="Times New Roman"/>
-                <w:b/>
-                <w:bCs/>
-                <w:sz w:val="22"/>
-                <w:szCs w:val="22"/>
-              </w:rPr>
-              <w:t xml:space="preserve">8</w:t>
-            </w:r>
-          </w:p>
-        </w:tc>
-        <w:tc>
-          <w:tcPr>
-            <w:tcW w:type="dxa" w:w="4500"/>
-            <w:tcBorders>
-              <w:top w:val="single" w:color="BFBFBF" w:sz="6"/>
-              <w:left w:val="single" w:color="BFBFBF" w:sz="6"/>
-              <w:bottom w:val="single" w:color="BFBFBF" w:sz="6"/>
-              <w:right w:val="single" w:color="BFBFBF" w:sz="6"/>
-            </w:tcBorders>
-            <w:shd w:fill="F2EFE6" w:color="auto" w:val="clear"/>
-            <w:tcMar>
-              <w:top w:type="dxa" w:w="70"/>
-              <w:left w:type="dxa" w:w="110"/>
-              <w:bottom w:type="dxa" w:w="70"/>
-              <w:right w:type="dxa" w:w="110"/>
-            </w:tcMar>
-            <w:vAlign w:val="center"/>
-          </w:tcPr>
-          <w:p>
-            <w:pPr>
-              <w:spacing w:after="50" w:line="264"/>
-              <w:jc w:val="left"/>
-            </w:pPr>
-            <w:r>
-              <w:rPr>
-                <w:rFonts w:ascii="Times New Roman" w:cs="Times New Roman" w:eastAsia="Times New Roman" w:hAnsi="Times New Roman"/>
-                <w:b w:val="false"/>
-                <w:bCs w:val="false"/>
-                <w:sz w:val="22"/>
-                <w:szCs w:val="22"/>
-              </w:rPr>
-              <w:t xml:space="preserve">Учебный датасет в формате CSV</w:t>
-            </w:r>
-          </w:p>
-        </w:tc>
-        <w:tc>
-          <w:tcPr>
-            <w:tcW w:type="dxa" w:w="4538"/>
-            <w:tcBorders>
-              <w:top w:val="single" w:color="BFBFBF" w:sz="6"/>
-              <w:left w:val="single" w:color="BFBFBF" w:sz="6"/>
-              <w:bottom w:val="single" w:color="BFBFBF" w:sz="6"/>
-              <w:right w:val="single" w:color="BFBFBF" w:sz="6"/>
-            </w:tcBorders>
-            <w:shd w:fill="F2EFE6" w:color="auto" w:val="clear"/>
-            <w:tcMar>
-              <w:top w:type="dxa" w:w="70"/>
-              <w:left w:type="dxa" w:w="110"/>
-              <w:bottom w:type="dxa" w:w="70"/>
-              <w:right w:type="dxa" w:w="110"/>
-            </w:tcMar>
-            <w:vAlign w:val="center"/>
-          </w:tcPr>
-          <w:p>
-            <w:pPr>
-              <w:spacing w:after="50" w:line="264"/>
-              <w:jc w:val="left"/>
-            </w:pPr>
-            <w:r>
-              <w:rPr>
-                <w:rFonts w:ascii="Times New Roman" w:cs="Times New Roman" w:eastAsia="Times New Roman" w:hAnsi="Times New Roman"/>
-                <w:b w:val="false"/>
-                <w:bCs w:val="false"/>
-                <w:sz w:val="22"/>
-                <w:szCs w:val="22"/>
-              </w:rPr>
-              <w:t xml:space="preserve">Средство</w:t>
-            </w:r>
-          </w:p>
-        </w:tc>
-      </w:tr>
-      <w:tr>
-        <w:trPr>
-          <w:cantSplit/>
-        </w:trPr>
-        <w:tc>
-          <w:tcPr>
-            <w:tcW w:type="dxa" w:w="600"/>
-            <w:tcBorders>
-              <w:top w:val="single" w:color="BFBFBF" w:sz="6"/>
-              <w:left w:val="single" w:color="BFBFBF" w:sz="6"/>
-              <w:bottom w:val="single" w:color="BFBFBF" w:sz="6"/>
-              <w:right w:val="single" w:color="BFBFBF" w:sz="6"/>
-            </w:tcBorders>
-            <w:tcMar>
-              <w:top w:type="dxa" w:w="70"/>
-              <w:left w:type="dxa" w:w="110"/>
-              <w:bottom w:type="dxa" w:w="70"/>
-              <w:right w:type="dxa" w:w="110"/>
-            </w:tcMar>
-            <w:vAlign w:val="center"/>
-          </w:tcPr>
-          <w:p>
-            <w:pPr>
-              <w:spacing w:after="50" w:line="264"/>
-              <w:jc w:val="left"/>
-            </w:pPr>
-            <w:r>
-              <w:rPr>
-                <w:rFonts w:ascii="Times New Roman" w:cs="Times New Roman" w:eastAsia="Times New Roman" w:hAnsi="Times New Roman"/>
-                <w:b/>
-                <w:bCs/>
-                <w:sz w:val="22"/>
-                <w:szCs w:val="22"/>
-              </w:rPr>
-              <w:t xml:space="preserve">9</w:t>
-            </w:r>
-          </w:p>
-        </w:tc>
-        <w:tc>
-          <w:tcPr>
-            <w:tcW w:type="dxa" w:w="4500"/>
-            <w:tcBorders>
-              <w:top w:val="single" w:color="BFBFBF" w:sz="6"/>
-              <w:left w:val="single" w:color="BFBFBF" w:sz="6"/>
-              <w:bottom w:val="single" w:color="BFBFBF" w:sz="6"/>
-              <w:right w:val="single" w:color="BFBFBF" w:sz="6"/>
-            </w:tcBorders>
-            <w:tcMar>
-              <w:top w:type="dxa" w:w="70"/>
-              <w:left w:type="dxa" w:w="110"/>
-              <w:bottom w:type="dxa" w:w="70"/>
-              <w:right w:type="dxa" w:w="110"/>
-            </w:tcMar>
-            <w:vAlign w:val="center"/>
-          </w:tcPr>
-          <w:p>
-            <w:pPr>
-              <w:spacing w:after="50" w:line="264"/>
-              <w:jc w:val="left"/>
-            </w:pPr>
-            <w:r>
-              <w:rPr>
-                <w:rFonts w:ascii="Times New Roman" w:cs="Times New Roman" w:eastAsia="Times New Roman" w:hAnsi="Times New Roman"/>
-                <w:b w:val="false"/>
-                <w:bCs w:val="false"/>
-                <w:sz w:val="22"/>
-                <w:szCs w:val="22"/>
-              </w:rPr>
-              <w:t xml:space="preserve">Деловая игра</w:t>
-            </w:r>
-          </w:p>
-        </w:tc>
-        <w:tc>
-          <w:tcPr>
-            <w:tcW w:type="dxa" w:w="4538"/>
-            <w:tcBorders>
-              <w:top w:val="single" w:color="BFBFBF" w:sz="6"/>
-              <w:left w:val="single" w:color="BFBFBF" w:sz="6"/>
-              <w:bottom w:val="single" w:color="BFBFBF" w:sz="6"/>
-              <w:right w:val="single" w:color="BFBFBF" w:sz="6"/>
-            </w:tcBorders>
-            <w:tcMar>
-              <w:top w:type="dxa" w:w="70"/>
-              <w:left w:type="dxa" w:w="110"/>
-              <w:bottom w:type="dxa" w:w="70"/>
-              <w:right w:type="dxa" w:w="110"/>
-            </w:tcMar>
-            <w:vAlign w:val="center"/>
-          </w:tcPr>
-          <w:p>
-            <w:pPr>
-              <w:spacing w:after="50" w:line="264"/>
-              <w:jc w:val="left"/>
-            </w:pPr>
-            <w:r>
-              <w:rPr>
-                <w:rFonts w:ascii="Times New Roman" w:cs="Times New Roman" w:eastAsia="Times New Roman" w:hAnsi="Times New Roman"/>
-                <w:b w:val="false"/>
-                <w:bCs w:val="false"/>
-                <w:sz w:val="22"/>
-                <w:szCs w:val="22"/>
-              </w:rPr>
-              <w:t xml:space="preserve">Метод (интерактивный)</w:t>
-            </w:r>
-          </w:p>
-        </w:tc>
-      </w:tr>
-      <w:tr>
-        <w:trPr>
-          <w:cantSplit/>
-        </w:trPr>
-        <w:tc>
-          <w:tcPr>
-            <w:tcW w:type="dxa" w:w="600"/>
-            <w:tcBorders>
-              <w:top w:val="single" w:color="BFBFBF" w:sz="6"/>
-              <w:left w:val="single" w:color="BFBFBF" w:sz="6"/>
-              <w:bottom w:val="single" w:color="BFBFBF" w:sz="6"/>
-              <w:right w:val="single" w:color="BFBFBF" w:sz="6"/>
-            </w:tcBorders>
-            <w:shd w:fill="F2EFE6" w:color="auto" w:val="clear"/>
-            <w:tcMar>
-              <w:top w:type="dxa" w:w="70"/>
-              <w:left w:type="dxa" w:w="110"/>
-              <w:bottom w:type="dxa" w:w="70"/>
-              <w:right w:type="dxa" w:w="110"/>
-            </w:tcMar>
-            <w:vAlign w:val="center"/>
-          </w:tcPr>
-          <w:p>
-            <w:pPr>
-              <w:spacing w:after="50" w:line="264"/>
-              <w:jc w:val="left"/>
-            </w:pPr>
-            <w:r>
-              <w:rPr>
-                <w:rFonts w:ascii="Times New Roman" w:cs="Times New Roman" w:eastAsia="Times New Roman" w:hAnsi="Times New Roman"/>
-                <w:b/>
-                <w:bCs/>
-                <w:sz w:val="22"/>
-                <w:szCs w:val="22"/>
-              </w:rPr>
-              <w:t xml:space="preserve">10</w:t>
-            </w:r>
-          </w:p>
-        </w:tc>
-        <w:tc>
-          <w:tcPr>
-            <w:tcW w:type="dxa" w:w="4500"/>
-            <w:tcBorders>
-              <w:top w:val="single" w:color="BFBFBF" w:sz="6"/>
-              <w:left w:val="single" w:color="BFBFBF" w:sz="6"/>
-              <w:bottom w:val="single" w:color="BFBFBF" w:sz="6"/>
-              <w:right w:val="single" w:color="BFBFBF" w:sz="6"/>
-            </w:tcBorders>
-            <w:shd w:fill="F2EFE6" w:color="auto" w:val="clear"/>
-            <w:tcMar>
-              <w:top w:type="dxa" w:w="70"/>
-              <w:left w:type="dxa" w:w="110"/>
-              <w:bottom w:type="dxa" w:w="70"/>
-              <w:right w:type="dxa" w:w="110"/>
-            </w:tcMar>
-            <w:vAlign w:val="center"/>
-          </w:tcPr>
-          <w:p>
-            <w:pPr>
-              <w:spacing w:after="50" w:line="264"/>
-              <w:jc w:val="left"/>
-            </w:pPr>
-            <w:r>
-              <w:rPr>
-                <w:rFonts w:ascii="Times New Roman" w:cs="Times New Roman" w:eastAsia="Times New Roman" w:hAnsi="Times New Roman"/>
-                <w:b w:val="false"/>
-                <w:bCs w:val="false"/>
-                <w:sz w:val="22"/>
-                <w:szCs w:val="22"/>
-              </w:rPr>
-              <w:t xml:space="preserve">Самостоятельная работа студента (СРС)</w:t>
-            </w:r>
-          </w:p>
-        </w:tc>
-        <w:tc>
-          <w:tcPr>
-            <w:tcW w:type="dxa" w:w="4538"/>
-            <w:tcBorders>
-              <w:top w:val="single" w:color="BFBFBF" w:sz="6"/>
-              <w:left w:val="single" w:color="BFBFBF" w:sz="6"/>
-              <w:bottom w:val="single" w:color="BFBFBF" w:sz="6"/>
-              <w:right w:val="single" w:color="BFBFBF" w:sz="6"/>
-            </w:tcBorders>
-            <w:shd w:fill="F2EFE6" w:color="auto" w:val="clear"/>
-            <w:tcMar>
-              <w:top w:type="dxa" w:w="70"/>
-              <w:left w:type="dxa" w:w="110"/>
-              <w:bottom w:type="dxa" w:w="70"/>
-              <w:right w:type="dxa" w:w="110"/>
-            </w:tcMar>
-            <w:vAlign w:val="center"/>
-          </w:tcPr>
-          <w:p>
-            <w:pPr>
-              <w:spacing w:after="50" w:line="264"/>
-              <w:jc w:val="left"/>
-            </w:pPr>
-            <w:r>
-              <w:rPr>
-                <w:rFonts w:ascii="Times New Roman" w:cs="Times New Roman" w:eastAsia="Times New Roman" w:hAnsi="Times New Roman"/>
-                <w:b w:val="false"/>
-                <w:bCs w:val="false"/>
-                <w:sz w:val="22"/>
-                <w:szCs w:val="22"/>
-              </w:rPr>
-              <w:t xml:space="preserve">Форма организации обучения</w:t>
-            </w:r>
-          </w:p>
-        </w:tc>
-      </w:tr>
-      <w:tr>
-        <w:trPr>
-          <w:cantSplit/>
-        </w:trPr>
-        <w:tc>
-          <w:tcPr>
-            <w:tcW w:type="dxa" w:w="600"/>
-            <w:tcBorders>
-              <w:top w:val="single" w:color="BFBFBF" w:sz="6"/>
-              <w:left w:val="single" w:color="BFBFBF" w:sz="6"/>
-              <w:bottom w:val="single" w:color="BFBFBF" w:sz="6"/>
-              <w:right w:val="single" w:color="BFBFBF" w:sz="6"/>
-            </w:tcBorders>
-            <w:tcMar>
-              <w:top w:type="dxa" w:w="70"/>
-              <w:left w:type="dxa" w:w="110"/>
-              <w:bottom w:type="dxa" w:w="70"/>
-              <w:right w:type="dxa" w:w="110"/>
-            </w:tcMar>
-            <w:vAlign w:val="center"/>
-          </w:tcPr>
-          <w:p>
-            <w:pPr>
-              <w:spacing w:after="50" w:line="264"/>
-              <w:jc w:val="left"/>
-            </w:pPr>
-            <w:r>
-              <w:rPr>
-                <w:rFonts w:ascii="Times New Roman" w:cs="Times New Roman" w:eastAsia="Times New Roman" w:hAnsi="Times New Roman"/>
-                <w:b/>
-                <w:bCs/>
-                <w:sz w:val="22"/>
-                <w:szCs w:val="22"/>
-              </w:rPr>
-              <w:t xml:space="preserve">11</w:t>
-            </w:r>
-          </w:p>
-        </w:tc>
-        <w:tc>
-          <w:tcPr>
-            <w:tcW w:type="dxa" w:w="4500"/>
-            <w:tcBorders>
-              <w:top w:val="single" w:color="BFBFBF" w:sz="6"/>
-              <w:left w:val="single" w:color="BFBFBF" w:sz="6"/>
-              <w:bottom w:val="single" w:color="BFBFBF" w:sz="6"/>
-              <w:right w:val="single" w:color="BFBFBF" w:sz="6"/>
-            </w:tcBorders>
-            <w:tcMar>
-              <w:top w:type="dxa" w:w="70"/>
-              <w:left w:type="dxa" w:w="110"/>
-              <w:bottom w:type="dxa" w:w="70"/>
-              <w:right w:type="dxa" w:w="110"/>
-            </w:tcMar>
-            <w:vAlign w:val="center"/>
-          </w:tcPr>
-          <w:p>
-            <w:pPr>
-              <w:spacing w:after="50" w:line="264"/>
-              <w:jc w:val="left"/>
-            </w:pPr>
-            <w:r>
-              <w:rPr>
-                <w:rFonts w:ascii="Times New Roman" w:cs="Times New Roman" w:eastAsia="Times New Roman" w:hAnsi="Times New Roman"/>
-                <w:b w:val="false"/>
-                <w:bCs w:val="false"/>
-                <w:sz w:val="22"/>
-                <w:szCs w:val="22"/>
-              </w:rPr>
-              <w:t xml:space="preserve">Приём «мозговой штурм» внутри дискуссии</w:t>
-            </w:r>
-          </w:p>
-        </w:tc>
-        <w:tc>
-          <w:tcPr>
-            <w:tcW w:type="dxa" w:w="4538"/>
-            <w:tcBorders>
-              <w:top w:val="single" w:color="BFBFBF" w:sz="6"/>
-              <w:left w:val="single" w:color="BFBFBF" w:sz="6"/>
-              <w:bottom w:val="single" w:color="BFBFBF" w:sz="6"/>
-              <w:right w:val="single" w:color="BFBFBF" w:sz="6"/>
-            </w:tcBorders>
-            <w:tcMar>
-              <w:top w:type="dxa" w:w="70"/>
-              <w:left w:type="dxa" w:w="110"/>
-              <w:bottom w:type="dxa" w:w="70"/>
-              <w:right w:type="dxa" w:w="110"/>
-            </w:tcMar>
-            <w:vAlign w:val="center"/>
-          </w:tcPr>
-          <w:p>
-            <w:pPr>
-              <w:spacing w:after="50" w:line="264"/>
-              <w:jc w:val="left"/>
-            </w:pPr>
-            <w:r>
-              <w:rPr>
-                <w:rFonts w:ascii="Times New Roman" w:cs="Times New Roman" w:eastAsia="Times New Roman" w:hAnsi="Times New Roman"/>
-                <w:b w:val="false"/>
-                <w:bCs w:val="false"/>
-                <w:sz w:val="22"/>
-                <w:szCs w:val="22"/>
-              </w:rPr>
-              <w:t xml:space="preserve">Приём</w:t>
-            </w:r>
-          </w:p>
-        </w:tc>
-      </w:tr>
-      <w:tr>
-        <w:trPr>
-          <w:cantSplit/>
-        </w:trPr>
-        <w:tc>
-          <w:tcPr>
-            <w:tcW w:type="dxa" w:w="600"/>
-            <w:tcBorders>
-              <w:top w:val="single" w:color="BFBFBF" w:sz="6"/>
-              <w:left w:val="single" w:color="BFBFBF" w:sz="6"/>
-              <w:bottom w:val="single" w:color="BFBFBF" w:sz="6"/>
-              <w:right w:val="single" w:color="BFBFBF" w:sz="6"/>
-            </w:tcBorders>
-            <w:shd w:fill="F2EFE6" w:color="auto" w:val="clear"/>
-            <w:tcMar>
-              <w:top w:type="dxa" w:w="70"/>
-              <w:left w:type="dxa" w:w="110"/>
-              <w:bottom w:type="dxa" w:w="70"/>
-              <w:right w:type="dxa" w:w="110"/>
-            </w:tcMar>
-            <w:vAlign w:val="center"/>
-          </w:tcPr>
-          <w:p>
-            <w:pPr>
-              <w:spacing w:after="50" w:line="264"/>
-              <w:jc w:val="left"/>
-            </w:pPr>
-            <w:r>
-              <w:rPr>
-                <w:rFonts w:ascii="Times New Roman" w:cs="Times New Roman" w:eastAsia="Times New Roman" w:hAnsi="Times New Roman"/>
-                <w:b/>
-                <w:bCs/>
-                <w:sz w:val="22"/>
-                <w:szCs w:val="22"/>
-              </w:rPr>
-              <w:t xml:space="preserve">12</w:t>
-            </w:r>
-          </w:p>
-        </w:tc>
-        <w:tc>
-          <w:tcPr>
-            <w:tcW w:type="dxa" w:w="4500"/>
-            <w:tcBorders>
-              <w:top w:val="single" w:color="BFBFBF" w:sz="6"/>
-              <w:left w:val="single" w:color="BFBFBF" w:sz="6"/>
-              <w:bottom w:val="single" w:color="BFBFBF" w:sz="6"/>
-              <w:right w:val="single" w:color="BFBFBF" w:sz="6"/>
-            </w:tcBorders>
-            <w:shd w:fill="F2EFE6" w:color="auto" w:val="clear"/>
-            <w:tcMar>
-              <w:top w:type="dxa" w:w="70"/>
-              <w:left w:type="dxa" w:w="110"/>
-              <w:bottom w:type="dxa" w:w="70"/>
-              <w:right w:type="dxa" w:w="110"/>
-            </w:tcMar>
-            <w:vAlign w:val="center"/>
-          </w:tcPr>
-          <w:p>
-            <w:pPr>
-              <w:spacing w:after="50" w:line="264"/>
-              <w:jc w:val="left"/>
-            </w:pPr>
-            <w:r>
-              <w:rPr>
-                <w:rFonts w:ascii="Times New Roman" w:cs="Times New Roman" w:eastAsia="Times New Roman" w:hAnsi="Times New Roman"/>
-                <w:b w:val="false"/>
-                <w:bCs w:val="false"/>
-                <w:sz w:val="22"/>
-                <w:szCs w:val="22"/>
-              </w:rPr>
-              <w:t xml:space="preserve">Виртуальный тренажёр</w:t>
-            </w:r>
-          </w:p>
-        </w:tc>
-        <w:tc>
-          <w:tcPr>
-            <w:tcW w:type="dxa" w:w="4538"/>
-            <w:tcBorders>
-              <w:top w:val="single" w:color="BFBFBF" w:sz="6"/>
-              <w:left w:val="single" w:color="BFBFBF" w:sz="6"/>
-              <w:bottom w:val="single" w:color="BFBFBF" w:sz="6"/>
-              <w:right w:val="single" w:color="BFBFBF" w:sz="6"/>
-            </w:tcBorders>
-            <w:shd w:fill="F2EFE6" w:color="auto" w:val="clear"/>
-            <w:tcMar>
-              <w:top w:type="dxa" w:w="70"/>
-              <w:left w:type="dxa" w:w="110"/>
-              <w:bottom w:type="dxa" w:w="70"/>
-              <w:right w:type="dxa" w:w="110"/>
-            </w:tcMar>
-            <w:vAlign w:val="center"/>
-          </w:tcPr>
-          <w:p>
-            <w:pPr>
-              <w:spacing w:after="50" w:line="264"/>
-              <w:jc w:val="left"/>
-            </w:pPr>
-            <w:r>
-              <w:rPr>
-                <w:rFonts w:ascii="Times New Roman" w:cs="Times New Roman" w:eastAsia="Times New Roman" w:hAnsi="Times New Roman"/>
-                <w:b w:val="false"/>
-                <w:bCs w:val="false"/>
-                <w:sz w:val="22"/>
-                <w:szCs w:val="22"/>
-              </w:rPr>
-              <w:t xml:space="preserve">Средство</w:t>
+              <w:t xml:space="preserve">Логическая ошибка: обе ветки делают одно и то же, права выдаются всем. Серьёзность: критическая (безопасность). Исправление: убрать выдачу прав во второй ветке, добавить тест</w:t>
             </w:r>
           </w:p>
         </w:tc>
@@ -3741,7 +3298,7 @@
                 <w:sz w:val="24"/>
                 <w:szCs w:val="24"/>
               </w:rPr>
-              <w:t xml:space="preserve">Карточка 7 (чек-лист) специально допускает два ответа: как инструмент самоконтроля это приём, как напечатанный раздаточный материал это средство. Обсуждение этой карточки показывает, что граница между приёмом и средством проходит по функции, а не по предмету.</w:t>
+              <w:t xml:space="preserve">Фрагмент 4 вызывает споры о серьёзности: сам по себе он не ломает программу, но показывает, что константы не используются, а значит их изменение ничего не поменяет. Это повод обсудить, почему «низкая серьёзность» не значит «можно не исправлять».</w:t>
             </w:r>
           </w:p>
           <w:p>
@@ -3755,7 +3312,7 @@
                 <w:sz w:val="24"/>
                 <w:szCs w:val="24"/>
               </w:rPr>
-              <w:t xml:space="preserve">Типичная ошибка: студенты относят «семинар» и «кейс-стади» к одной категории. Полезно спросить: можно ли провести семинар без кейса и кейс вне семинара? Да и да, значит это разные вещи: форма и метод.</w:t>
+              <w:t xml:space="preserve">Фрагмент 6 обычно находят последним: код выглядит «аккуратно», и глаз скользит мимо. Полезно спросить: какой тест поймал бы эту ошибку? Это переход к теме тестов в кейсе.</w:t>
             </w:r>
           </w:p>
         </w:tc>
@@ -3775,7 +3332,7 @@
           <w:sz w:val="30"/>
           <w:szCs w:val="30"/>
         </w:rPr>
-        <w:t xml:space="preserve">4. Упражнение 2. «От цели к форме»</w:t>
+        <w:t xml:space="preserve">4. Упражнение 2. «Замечание в ревью»</w:t>
       </w:r>
     </w:p>
     <w:p>
@@ -3799,7 +3356,31 @@
           <w:sz w:val="26"/>
           <w:szCs w:val="26"/>
         </w:rPr>
-        <w:t xml:space="preserve">научиться выбирать метод, форму и средство обучения исходя из учебной цели.</w:t>
+        <w:t xml:space="preserve">научиться формулировать замечание так, чтобы автор понял проблему и мог её исправить, не испытывая желания защищаться.</w:t>
+      </w:r>
+    </w:p>
+    <w:p>
+      <w:pPr>
+        <w:spacing w:after="100" w:line="276"/>
+        <w:jc w:val="both"/>
+      </w:pPr>
+      <w:r>
+        <w:rPr>
+          <w:rFonts w:ascii="Times New Roman" w:cs="Times New Roman" w:eastAsia="Times New Roman" w:hAnsi="Times New Roman"/>
+          <w:b/>
+          <w:bCs/>
+          <w:sz w:val="26"/>
+          <w:szCs w:val="26"/>
+        </w:rPr>
+        <w:t xml:space="preserve">Правило «факт, последствие, предложение»: </w:t>
+      </w:r>
+      <w:r>
+        <w:rPr>
+          <w:rFonts w:ascii="Times New Roman" w:cs="Times New Roman" w:eastAsia="Times New Roman" w:hAnsi="Times New Roman"/>
+          <w:sz w:val="26"/>
+          <w:szCs w:val="26"/>
+        </w:rPr>
+        <w:t xml:space="preserve">что именно не так (с указанием места), к чему это приведёт, что предлагается сделать. Необязательные замечания помечаются словом nit.</w:t>
       </w:r>
     </w:p>
     <w:p>
@@ -3823,23 +3404,7 @@
           <w:sz w:val="26"/>
           <w:szCs w:val="26"/>
         </w:rPr>
-        <w:t xml:space="preserve">в группе по 3–4 человека заполните таблицу: для каждой учебной цели подберите метод, форму занятия и одно средство. Для каждой строки подготовьте обоснование в одном предложении: почему именно так. Время 12 минут. Затем каждая группа представляет одну строку, остальные группы дополняют или возражают.</w:t>
-      </w:r>
-    </w:p>
-    <w:p>
-      <w:pPr>
-        <w:spacing w:after="100" w:line="276"/>
-        <w:jc w:val="both"/>
-      </w:pPr>
-      <w:r>
-        <w:rPr>
-          <w:rFonts w:ascii="Times New Roman" w:cs="Times New Roman" w:eastAsia="Times New Roman" w:hAnsi="Times New Roman"/>
-          <w:i/>
-          <w:iCs/>
-          <w:sz w:val="26"/>
-          <w:szCs w:val="26"/>
-        </w:rPr>
-        <w:t xml:space="preserve">Таблица ниже содержит один из возможных вариантов решения. Другие варианты принимаются, если обоснование опирается на цель и условия.</w:t>
+        <w:t xml:space="preserve">в группе по 3–4 человека перепишите 5 комментариев ревьюера по правилу. Контекст каждого комментария придумайте сами, но он должен быть правдоподобным. Время 10 минут. Затем каждая группа зачитывает один вариант, остальные оценивают: понял бы автор, что делать?</w:t>
       </w:r>
     </w:p>
     <w:tbl>
@@ -3855,10 +3420,8 @@
         </w:tblBorders>
       </w:tblPr>
       <w:tblGrid>
-        <w:gridCol w:w="2600"/>
-        <w:gridCol w:w="2300"/>
-        <w:gridCol w:w="2300"/>
-        <w:gridCol w:w="2438"/>
+        <w:gridCol w:w="3800"/>
+        <w:gridCol w:w="5838"/>
       </w:tblGrid>
       <w:tr>
         <w:trPr>
@@ -3866,7 +3429,7 @@
         </w:trPr>
         <w:tc>
           <w:tcPr>
-            <w:tcW w:type="dxa" w:w="2600"/>
+            <w:tcW w:type="dxa" w:w="3800"/>
             <w:tcBorders>
               <w:top w:val="single" w:color="BFBFBF" w:sz="6"/>
               <w:left w:val="single" w:color="BFBFBF" w:sz="6"/>
@@ -3896,13 +3459,13 @@
                 <w:sz w:val="22"/>
                 <w:szCs w:val="22"/>
               </w:rPr>
-              <w:t xml:space="preserve">Учебная цель</w:t>
-            </w:r>
-          </w:p>
-        </w:tc>
-        <w:tc>
-          <w:tcPr>
-            <w:tcW w:type="dxa" w:w="2300"/>
+              <w:t xml:space="preserve">Исходный комментарий ревьюера</w:t>
+            </w:r>
+          </w:p>
+        </w:tc>
+        <w:tc>
+          <w:tcPr>
+            <w:tcW w:type="dxa" w:w="5838"/>
             <w:tcBorders>
               <w:top w:val="single" w:color="BFBFBF" w:sz="6"/>
               <w:left w:val="single" w:color="BFBFBF" w:sz="6"/>
@@ -3932,79 +3495,7 @@
                 <w:sz w:val="22"/>
                 <w:szCs w:val="22"/>
               </w:rPr>
-              <w:t xml:space="preserve">Подходящий метод</w:t>
-            </w:r>
-          </w:p>
-        </w:tc>
-        <w:tc>
-          <w:tcPr>
-            <w:tcW w:type="dxa" w:w="2300"/>
-            <w:tcBorders>
-              <w:top w:val="single" w:color="BFBFBF" w:sz="6"/>
-              <w:left w:val="single" w:color="BFBFBF" w:sz="6"/>
-              <w:bottom w:val="single" w:color="BFBFBF" w:sz="6"/>
-              <w:right w:val="single" w:color="BFBFBF" w:sz="6"/>
-            </w:tcBorders>
-            <w:shd w:fill="1B2A41" w:color="auto" w:val="clear"/>
-            <w:tcMar>
-              <w:top w:type="dxa" w:w="70"/>
-              <w:left w:type="dxa" w:w="110"/>
-              <w:bottom w:type="dxa" w:w="70"/>
-              <w:right w:type="dxa" w:w="110"/>
-            </w:tcMar>
-            <w:vAlign w:val="center"/>
-          </w:tcPr>
-          <w:p>
-            <w:pPr>
-              <w:spacing w:after="50" w:line="264"/>
-              <w:jc w:val="left"/>
-            </w:pPr>
-            <w:r>
-              <w:rPr>
-                <w:rFonts w:ascii="Times New Roman" w:cs="Times New Roman" w:eastAsia="Times New Roman" w:hAnsi="Times New Roman"/>
-                <w:b/>
-                <w:bCs/>
-                <w:color w:val="FFFFFF"/>
-                <w:sz w:val="22"/>
-                <w:szCs w:val="22"/>
-              </w:rPr>
-              <w:t xml:space="preserve">Форма</w:t>
-            </w:r>
-          </w:p>
-        </w:tc>
-        <w:tc>
-          <w:tcPr>
-            <w:tcW w:type="dxa" w:w="2438"/>
-            <w:tcBorders>
-              <w:top w:val="single" w:color="BFBFBF" w:sz="6"/>
-              <w:left w:val="single" w:color="BFBFBF" w:sz="6"/>
-              <w:bottom w:val="single" w:color="BFBFBF" w:sz="6"/>
-              <w:right w:val="single" w:color="BFBFBF" w:sz="6"/>
-            </w:tcBorders>
-            <w:shd w:fill="1B2A41" w:color="auto" w:val="clear"/>
-            <w:tcMar>
-              <w:top w:type="dxa" w:w="70"/>
-              <w:left w:type="dxa" w:w="110"/>
-              <w:bottom w:type="dxa" w:w="70"/>
-              <w:right w:type="dxa" w:w="110"/>
-            </w:tcMar>
-            <w:vAlign w:val="center"/>
-          </w:tcPr>
-          <w:p>
-            <w:pPr>
-              <w:spacing w:after="50" w:line="264"/>
-              <w:jc w:val="left"/>
-            </w:pPr>
-            <w:r>
-              <w:rPr>
-                <w:rFonts w:ascii="Times New Roman" w:cs="Times New Roman" w:eastAsia="Times New Roman" w:hAnsi="Times New Roman"/>
-                <w:b/>
-                <w:bCs/>
-                <w:color w:val="FFFFFF"/>
-                <w:sz w:val="22"/>
-                <w:szCs w:val="22"/>
-              </w:rPr>
-              <w:t xml:space="preserve">Средство</w:t>
+              <w:t xml:space="preserve">Вариант переформулировки (ключ)</w:t>
             </w:r>
           </w:p>
         </w:tc>
@@ -4015,7 +3506,7 @@
         </w:trPr>
         <w:tc>
           <w:tcPr>
-            <w:tcW w:type="dxa" w:w="2600"/>
+            <w:tcW w:type="dxa" w:w="3800"/>
             <w:tcBorders>
               <w:top w:val="single" w:color="BFBFBF" w:sz="6"/>
               <w:left w:val="single" w:color="BFBFBF" w:sz="6"/>
@@ -4043,109 +3534,41 @@
                 <w:sz w:val="22"/>
                 <w:szCs w:val="22"/>
               </w:rPr>
-              <w:t xml:space="preserve">Студенты знают основные положения теории самодетерминации</w:t>
-            </w:r>
-          </w:p>
-        </w:tc>
-        <w:tc>
-          <w:tcPr>
-            <w:tcW w:type="dxa" w:w="2300"/>
-            <w:tcBorders>
-              <w:top w:val="single" w:color="BFBFBF" w:sz="6"/>
-              <w:left w:val="single" w:color="BFBFBF" w:sz="6"/>
-              <w:bottom w:val="single" w:color="BFBFBF" w:sz="6"/>
-              <w:right w:val="single" w:color="BFBFBF" w:sz="6"/>
-            </w:tcBorders>
-            <w:tcMar>
-              <w:top w:type="dxa" w:w="70"/>
-              <w:left w:type="dxa" w:w="110"/>
-              <w:bottom w:type="dxa" w:w="70"/>
-              <w:right w:type="dxa" w:w="110"/>
-            </w:tcMar>
-            <w:vAlign w:val="center"/>
-          </w:tcPr>
-          <w:p>
-            <w:pPr>
-              <w:spacing w:after="50" w:line="264"/>
-              <w:jc w:val="left"/>
-            </w:pPr>
-            <w:r>
-              <w:rPr>
-                <w:rFonts w:ascii="Times New Roman" w:cs="Times New Roman" w:eastAsia="Times New Roman" w:hAnsi="Times New Roman"/>
-                <w:b w:val="false"/>
-                <w:bCs w:val="false"/>
-                <w:sz w:val="22"/>
-                <w:szCs w:val="22"/>
-              </w:rPr>
-              <w:t xml:space="preserve">Объяснительно-иллюстративный, проблемное изложение</w:t>
-            </w:r>
-          </w:p>
-        </w:tc>
-        <w:tc>
-          <w:tcPr>
-            <w:tcW w:type="dxa" w:w="2300"/>
-            <w:tcBorders>
-              <w:top w:val="single" w:color="BFBFBF" w:sz="6"/>
-              <w:left w:val="single" w:color="BFBFBF" w:sz="6"/>
-              <w:bottom w:val="single" w:color="BFBFBF" w:sz="6"/>
-              <w:right w:val="single" w:color="BFBFBF" w:sz="6"/>
-            </w:tcBorders>
-            <w:tcMar>
-              <w:top w:type="dxa" w:w="70"/>
-              <w:left w:type="dxa" w:w="110"/>
-              <w:bottom w:type="dxa" w:w="70"/>
-              <w:right w:type="dxa" w:w="110"/>
-            </w:tcMar>
-            <w:vAlign w:val="center"/>
-          </w:tcPr>
-          <w:p>
-            <w:pPr>
-              <w:spacing w:after="50" w:line="264"/>
-              <w:jc w:val="left"/>
-            </w:pPr>
-            <w:r>
-              <w:rPr>
-                <w:rFonts w:ascii="Times New Roman" w:cs="Times New Roman" w:eastAsia="Times New Roman" w:hAnsi="Times New Roman"/>
-                <w:b w:val="false"/>
-                <w:bCs w:val="false"/>
-                <w:sz w:val="22"/>
-                <w:szCs w:val="22"/>
-              </w:rPr>
-              <w:t xml:space="preserve">Лекция</w:t>
-            </w:r>
-          </w:p>
-        </w:tc>
-        <w:tc>
-          <w:tcPr>
-            <w:tcW w:type="dxa" w:w="2438"/>
-            <w:tcBorders>
-              <w:top w:val="single" w:color="BFBFBF" w:sz="6"/>
-              <w:left w:val="single" w:color="BFBFBF" w:sz="6"/>
-              <w:bottom w:val="single" w:color="BFBFBF" w:sz="6"/>
-              <w:right w:val="single" w:color="BFBFBF" w:sz="6"/>
-            </w:tcBorders>
-            <w:tcMar>
-              <w:top w:type="dxa" w:w="70"/>
-              <w:left w:type="dxa" w:w="110"/>
-              <w:bottom w:type="dxa" w:w="70"/>
-              <w:right w:type="dxa" w:w="110"/>
-            </w:tcMar>
-            <w:vAlign w:val="center"/>
-          </w:tcPr>
-          <w:p>
-            <w:pPr>
-              <w:spacing w:after="50" w:line="264"/>
-              <w:jc w:val="left"/>
-            </w:pPr>
-            <w:r>
-              <w:rPr>
-                <w:rFonts w:ascii="Times New Roman" w:cs="Times New Roman" w:eastAsia="Times New Roman" w:hAnsi="Times New Roman"/>
-                <w:b w:val="false"/>
-                <w:bCs w:val="false"/>
-                <w:sz w:val="22"/>
-                <w:szCs w:val="22"/>
-              </w:rPr>
-              <w:t xml:space="preserve">Слайды, конспект, схема теории</w:t>
+              <w:t xml:space="preserve">«Это ужасно, переделай.»</w:t>
+            </w:r>
+          </w:p>
+        </w:tc>
+        <w:tc>
+          <w:tcPr>
+            <w:tcW w:type="dxa" w:w="5838"/>
+            <w:tcBorders>
+              <w:top w:val="single" w:color="BFBFBF" w:sz="6"/>
+              <w:left w:val="single" w:color="BFBFBF" w:sz="6"/>
+              <w:bottom w:val="single" w:color="BFBFBF" w:sz="6"/>
+              <w:right w:val="single" w:color="BFBFBF" w:sz="6"/>
+            </w:tcBorders>
+            <w:tcMar>
+              <w:top w:type="dxa" w:w="70"/>
+              <w:left w:type="dxa" w:w="110"/>
+              <w:bottom w:type="dxa" w:w="70"/>
+              <w:right w:type="dxa" w:w="110"/>
+            </w:tcMar>
+            <w:vAlign w:val="center"/>
+          </w:tcPr>
+          <w:p>
+            <w:pPr>
+              <w:spacing w:after="50" w:line="264"/>
+              <w:jc w:val="left"/>
+            </w:pPr>
+            <w:r>
+              <w:rPr>
+                <w:rFonts w:ascii="Times New Roman" w:cs="Times New Roman" w:eastAsia="Times New Roman" w:hAnsi="Times New Roman"/>
+                <w:b w:val="false"/>
+                <w:bCs w:val="false"/>
+                <w:sz w:val="22"/>
+                <w:szCs w:val="22"/>
+              </w:rPr>
+              <w:t xml:space="preserve">Функция parse_date возвращает None при пустой строке, а вызывающий код этого не ожидает (упадёт на строке 42). Предлагаю бросать ValueError или обрабатывать None в вызывающем коде.</w:t>
             </w:r>
           </w:p>
         </w:tc>
@@ -4156,7 +3579,7 @@
         </w:trPr>
         <w:tc>
           <w:tcPr>
-            <w:tcW w:type="dxa" w:w="2600"/>
+            <w:tcW w:type="dxa" w:w="3800"/>
             <w:tcBorders>
               <w:top w:val="single" w:color="BFBFBF" w:sz="6"/>
               <w:left w:val="single" w:color="BFBFBF" w:sz="6"/>
@@ -4185,13 +3608,13 @@
                 <w:sz w:val="22"/>
                 <w:szCs w:val="22"/>
               </w:rPr>
-              <w:t xml:space="preserve">Студенты умеют рассчитывать доверительный интервал по выборке</w:t>
-            </w:r>
-          </w:p>
-        </w:tc>
-        <w:tc>
-          <w:tcPr>
-            <w:tcW w:type="dxa" w:w="2300"/>
+              <w:t xml:space="preserve">«Зачем ты так сделал?»</w:t>
+            </w:r>
+          </w:p>
+        </w:tc>
+        <w:tc>
+          <w:tcPr>
+            <w:tcW w:type="dxa" w:w="5838"/>
             <w:tcBorders>
               <w:top w:val="single" w:color="BFBFBF" w:sz="6"/>
               <w:left w:val="single" w:color="BFBFBF" w:sz="6"/>
@@ -4220,77 +3643,7 @@
                 <w:sz w:val="22"/>
                 <w:szCs w:val="22"/>
               </w:rPr>
-              <w:t xml:space="preserve">Репродуктивный, упражнение по образцу</w:t>
-            </w:r>
-          </w:p>
-        </w:tc>
-        <w:tc>
-          <w:tcPr>
-            <w:tcW w:type="dxa" w:w="2300"/>
-            <w:tcBorders>
-              <w:top w:val="single" w:color="BFBFBF" w:sz="6"/>
-              <w:left w:val="single" w:color="BFBFBF" w:sz="6"/>
-              <w:bottom w:val="single" w:color="BFBFBF" w:sz="6"/>
-              <w:right w:val="single" w:color="BFBFBF" w:sz="6"/>
-            </w:tcBorders>
-            <w:shd w:fill="F2EFE6" w:color="auto" w:val="clear"/>
-            <w:tcMar>
-              <w:top w:type="dxa" w:w="70"/>
-              <w:left w:type="dxa" w:w="110"/>
-              <w:bottom w:type="dxa" w:w="70"/>
-              <w:right w:type="dxa" w:w="110"/>
-            </w:tcMar>
-            <w:vAlign w:val="center"/>
-          </w:tcPr>
-          <w:p>
-            <w:pPr>
-              <w:spacing w:after="50" w:line="264"/>
-              <w:jc w:val="left"/>
-            </w:pPr>
-            <w:r>
-              <w:rPr>
-                <w:rFonts w:ascii="Times New Roman" w:cs="Times New Roman" w:eastAsia="Times New Roman" w:hAnsi="Times New Roman"/>
-                <w:b w:val="false"/>
-                <w:bCs w:val="false"/>
-                <w:sz w:val="22"/>
-                <w:szCs w:val="22"/>
-              </w:rPr>
-              <w:t xml:space="preserve">Практическое занятие</w:t>
-            </w:r>
-          </w:p>
-        </w:tc>
-        <w:tc>
-          <w:tcPr>
-            <w:tcW w:type="dxa" w:w="2438"/>
-            <w:tcBorders>
-              <w:top w:val="single" w:color="BFBFBF" w:sz="6"/>
-              <w:left w:val="single" w:color="BFBFBF" w:sz="6"/>
-              <w:bottom w:val="single" w:color="BFBFBF" w:sz="6"/>
-              <w:right w:val="single" w:color="BFBFBF" w:sz="6"/>
-            </w:tcBorders>
-            <w:shd w:fill="F2EFE6" w:color="auto" w:val="clear"/>
-            <w:tcMar>
-              <w:top w:type="dxa" w:w="70"/>
-              <w:left w:type="dxa" w:w="110"/>
-              <w:bottom w:type="dxa" w:w="70"/>
-              <w:right w:type="dxa" w:w="110"/>
-            </w:tcMar>
-            <w:vAlign w:val="center"/>
-          </w:tcPr>
-          <w:p>
-            <w:pPr>
-              <w:spacing w:after="50" w:line="264"/>
-              <w:jc w:val="left"/>
-            </w:pPr>
-            <w:r>
-              <w:rPr>
-                <w:rFonts w:ascii="Times New Roman" w:cs="Times New Roman" w:eastAsia="Times New Roman" w:hAnsi="Times New Roman"/>
-                <w:b w:val="false"/>
-                <w:bCs w:val="false"/>
-                <w:sz w:val="22"/>
-                <w:szCs w:val="22"/>
-              </w:rPr>
-              <w:t xml:space="preserve">Задачник, калькулятор или таблица</w:t>
+              <w:t xml:space="preserve">Здесь список пересоздаётся на каждой итерации, при 10 тыс. элементов это O(n²). Можно накапливать в set и преобразовать один раз в конце.</w:t>
             </w:r>
           </w:p>
         </w:tc>
@@ -4301,7 +3654,7 @@
         </w:trPr>
         <w:tc>
           <w:tcPr>
-            <w:tcW w:type="dxa" w:w="2600"/>
+            <w:tcW w:type="dxa" w:w="3800"/>
             <w:tcBorders>
               <w:top w:val="single" w:color="BFBFBF" w:sz="6"/>
               <w:left w:val="single" w:color="BFBFBF" w:sz="6"/>
@@ -4329,109 +3682,41 @@
                 <w:sz w:val="22"/>
                 <w:szCs w:val="22"/>
               </w:rPr>
-              <w:t xml:space="preserve">Студенты умеют настраивать и запускать эксперимент на оборудовании</w:t>
-            </w:r>
-          </w:p>
-        </w:tc>
-        <w:tc>
-          <w:tcPr>
-            <w:tcW w:type="dxa" w:w="2300"/>
-            <w:tcBorders>
-              <w:top w:val="single" w:color="BFBFBF" w:sz="6"/>
-              <w:left w:val="single" w:color="BFBFBF" w:sz="6"/>
-              <w:bottom w:val="single" w:color="BFBFBF" w:sz="6"/>
-              <w:right w:val="single" w:color="BFBFBF" w:sz="6"/>
-            </w:tcBorders>
-            <w:tcMar>
-              <w:top w:type="dxa" w:w="70"/>
-              <w:left w:type="dxa" w:w="110"/>
-              <w:bottom w:type="dxa" w:w="70"/>
-              <w:right w:type="dxa" w:w="110"/>
-            </w:tcMar>
-            <w:vAlign w:val="center"/>
-          </w:tcPr>
-          <w:p>
-            <w:pPr>
-              <w:spacing w:after="50" w:line="264"/>
-              <w:jc w:val="left"/>
-            </w:pPr>
-            <w:r>
-              <w:rPr>
-                <w:rFonts w:ascii="Times New Roman" w:cs="Times New Roman" w:eastAsia="Times New Roman" w:hAnsi="Times New Roman"/>
-                <w:b w:val="false"/>
-                <w:bCs w:val="false"/>
-                <w:sz w:val="22"/>
-                <w:szCs w:val="22"/>
-              </w:rPr>
-              <w:t xml:space="preserve">Практический, инструктаж</w:t>
-            </w:r>
-          </w:p>
-        </w:tc>
-        <w:tc>
-          <w:tcPr>
-            <w:tcW w:type="dxa" w:w="2300"/>
-            <w:tcBorders>
-              <w:top w:val="single" w:color="BFBFBF" w:sz="6"/>
-              <w:left w:val="single" w:color="BFBFBF" w:sz="6"/>
-              <w:bottom w:val="single" w:color="BFBFBF" w:sz="6"/>
-              <w:right w:val="single" w:color="BFBFBF" w:sz="6"/>
-            </w:tcBorders>
-            <w:tcMar>
-              <w:top w:type="dxa" w:w="70"/>
-              <w:left w:type="dxa" w:w="110"/>
-              <w:bottom w:type="dxa" w:w="70"/>
-              <w:right w:type="dxa" w:w="110"/>
-            </w:tcMar>
-            <w:vAlign w:val="center"/>
-          </w:tcPr>
-          <w:p>
-            <w:pPr>
-              <w:spacing w:after="50" w:line="264"/>
-              <w:jc w:val="left"/>
-            </w:pPr>
-            <w:r>
-              <w:rPr>
-                <w:rFonts w:ascii="Times New Roman" w:cs="Times New Roman" w:eastAsia="Times New Roman" w:hAnsi="Times New Roman"/>
-                <w:b w:val="false"/>
-                <w:bCs w:val="false"/>
-                <w:sz w:val="22"/>
-                <w:szCs w:val="22"/>
-              </w:rPr>
-              <w:t xml:space="preserve">Лабораторное занятие</w:t>
-            </w:r>
-          </w:p>
-        </w:tc>
-        <w:tc>
-          <w:tcPr>
-            <w:tcW w:type="dxa" w:w="2438"/>
-            <w:tcBorders>
-              <w:top w:val="single" w:color="BFBFBF" w:sz="6"/>
-              <w:left w:val="single" w:color="BFBFBF" w:sz="6"/>
-              <w:bottom w:val="single" w:color="BFBFBF" w:sz="6"/>
-              <w:right w:val="single" w:color="BFBFBF" w:sz="6"/>
-            </w:tcBorders>
-            <w:tcMar>
-              <w:top w:type="dxa" w:w="70"/>
-              <w:left w:type="dxa" w:w="110"/>
-              <w:bottom w:type="dxa" w:w="70"/>
-              <w:right w:type="dxa" w:w="110"/>
-            </w:tcMar>
-            <w:vAlign w:val="center"/>
-          </w:tcPr>
-          <w:p>
-            <w:pPr>
-              <w:spacing w:after="50" w:line="264"/>
-              <w:jc w:val="left"/>
-            </w:pPr>
-            <w:r>
-              <w:rPr>
-                <w:rFonts w:ascii="Times New Roman" w:cs="Times New Roman" w:eastAsia="Times New Roman" w:hAnsi="Times New Roman"/>
-                <w:b w:val="false"/>
-                <w:bCs w:val="false"/>
-                <w:sz w:val="22"/>
-                <w:szCs w:val="22"/>
-              </w:rPr>
-              <w:t xml:space="preserve">Установка, методические указания</w:t>
+              <w:t xml:space="preserve">«Нормально, но я бы написал иначе.»</w:t>
+            </w:r>
+          </w:p>
+        </w:tc>
+        <w:tc>
+          <w:tcPr>
+            <w:tcW w:type="dxa" w:w="5838"/>
+            <w:tcBorders>
+              <w:top w:val="single" w:color="BFBFBF" w:sz="6"/>
+              <w:left w:val="single" w:color="BFBFBF" w:sz="6"/>
+              <w:bottom w:val="single" w:color="BFBFBF" w:sz="6"/>
+              <w:right w:val="single" w:color="BFBFBF" w:sz="6"/>
+            </w:tcBorders>
+            <w:tcMar>
+              <w:top w:type="dxa" w:w="70"/>
+              <w:left w:type="dxa" w:w="110"/>
+              <w:bottom w:type="dxa" w:w="70"/>
+              <w:right w:type="dxa" w:w="110"/>
+            </w:tcMar>
+            <w:vAlign w:val="center"/>
+          </w:tcPr>
+          <w:p>
+            <w:pPr>
+              <w:spacing w:after="50" w:line="264"/>
+              <w:jc w:val="left"/>
+            </w:pPr>
+            <w:r>
+              <w:rPr>
+                <w:rFonts w:ascii="Times New Roman" w:cs="Times New Roman" w:eastAsia="Times New Roman" w:hAnsi="Times New Roman"/>
+                <w:b w:val="false"/>
+                <w:bCs w:val="false"/>
+                <w:sz w:val="22"/>
+                <w:szCs w:val="22"/>
+              </w:rPr>
+              <w:t xml:space="preserve">Работает корректно. Необязательное замечание (nit): цикл можно заменить на генератор, станет короче. На ваше усмотрение.</w:t>
             </w:r>
           </w:p>
         </w:tc>
@@ -4442,7 +3727,7 @@
         </w:trPr>
         <w:tc>
           <w:tcPr>
-            <w:tcW w:type="dxa" w:w="2600"/>
+            <w:tcW w:type="dxa" w:w="3800"/>
             <w:tcBorders>
               <w:top w:val="single" w:color="BFBFBF" w:sz="6"/>
               <w:left w:val="single" w:color="BFBFBF" w:sz="6"/>
@@ -4471,13 +3756,13 @@
                 <w:sz w:val="22"/>
                 <w:szCs w:val="22"/>
               </w:rPr>
-              <w:t xml:space="preserve">Студенты умеют аргументировать позицию по спорному вопросу</w:t>
-            </w:r>
-          </w:p>
-        </w:tc>
-        <w:tc>
-          <w:tcPr>
-            <w:tcW w:type="dxa" w:w="2300"/>
+              <w:t xml:space="preserve">«Тесты где???»</w:t>
+            </w:r>
+          </w:p>
+        </w:tc>
+        <w:tc>
+          <w:tcPr>
+            <w:tcW w:type="dxa" w:w="5838"/>
             <w:tcBorders>
               <w:top w:val="single" w:color="BFBFBF" w:sz="6"/>
               <w:left w:val="single" w:color="BFBFBF" w:sz="6"/>
@@ -4506,77 +3791,7 @@
                 <w:sz w:val="22"/>
                 <w:szCs w:val="22"/>
               </w:rPr>
-              <w:t xml:space="preserve">Дискуссия, дебаты</w:t>
-            </w:r>
-          </w:p>
-        </w:tc>
-        <w:tc>
-          <w:tcPr>
-            <w:tcW w:type="dxa" w:w="2300"/>
-            <w:tcBorders>
-              <w:top w:val="single" w:color="BFBFBF" w:sz="6"/>
-              <w:left w:val="single" w:color="BFBFBF" w:sz="6"/>
-              <w:bottom w:val="single" w:color="BFBFBF" w:sz="6"/>
-              <w:right w:val="single" w:color="BFBFBF" w:sz="6"/>
-            </w:tcBorders>
-            <w:shd w:fill="F2EFE6" w:color="auto" w:val="clear"/>
-            <w:tcMar>
-              <w:top w:type="dxa" w:w="70"/>
-              <w:left w:type="dxa" w:w="110"/>
-              <w:bottom w:type="dxa" w:w="70"/>
-              <w:right w:type="dxa" w:w="110"/>
-            </w:tcMar>
-            <w:vAlign w:val="center"/>
-          </w:tcPr>
-          <w:p>
-            <w:pPr>
-              <w:spacing w:after="50" w:line="264"/>
-              <w:jc w:val="left"/>
-            </w:pPr>
-            <w:r>
-              <w:rPr>
-                <w:rFonts w:ascii="Times New Roman" w:cs="Times New Roman" w:eastAsia="Times New Roman" w:hAnsi="Times New Roman"/>
-                <w:b w:val="false"/>
-                <w:bCs w:val="false"/>
-                <w:sz w:val="22"/>
-                <w:szCs w:val="22"/>
-              </w:rPr>
-              <w:t xml:space="preserve">Семинар</w:t>
-            </w:r>
-          </w:p>
-        </w:tc>
-        <w:tc>
-          <w:tcPr>
-            <w:tcW w:type="dxa" w:w="2438"/>
-            <w:tcBorders>
-              <w:top w:val="single" w:color="BFBFBF" w:sz="6"/>
-              <w:left w:val="single" w:color="BFBFBF" w:sz="6"/>
-              <w:bottom w:val="single" w:color="BFBFBF" w:sz="6"/>
-              <w:right w:val="single" w:color="BFBFBF" w:sz="6"/>
-            </w:tcBorders>
-            <w:shd w:fill="F2EFE6" w:color="auto" w:val="clear"/>
-            <w:tcMar>
-              <w:top w:type="dxa" w:w="70"/>
-              <w:left w:type="dxa" w:w="110"/>
-              <w:bottom w:type="dxa" w:w="70"/>
-              <w:right w:type="dxa" w:w="110"/>
-            </w:tcMar>
-            <w:vAlign w:val="center"/>
-          </w:tcPr>
-          <w:p>
-            <w:pPr>
-              <w:spacing w:after="50" w:line="264"/>
-              <w:jc w:val="left"/>
-            </w:pPr>
-            <w:r>
-              <w:rPr>
-                <w:rFonts w:ascii="Times New Roman" w:cs="Times New Roman" w:eastAsia="Times New Roman" w:hAnsi="Times New Roman"/>
-                <w:b w:val="false"/>
-                <w:bCs w:val="false"/>
-                <w:sz w:val="22"/>
-                <w:szCs w:val="22"/>
-              </w:rPr>
-              <w:t xml:space="preserve">Подборка текстов с разными позициями</w:t>
+              <w:t xml:space="preserve">К изменению в расчёте скидки нет тестов, а функция уже ломалась в релизе 2.3. Прошу добавить тесты на граничные случаи: скидка 0%, 100%, отрицательная сумма.</w:t>
             </w:r>
           </w:p>
         </w:tc>
@@ -4587,7 +3802,7 @@
         </w:trPr>
         <w:tc>
           <w:tcPr>
-            <w:tcW w:type="dxa" w:w="2600"/>
+            <w:tcW w:type="dxa" w:w="3800"/>
             <w:tcBorders>
               <w:top w:val="single" w:color="BFBFBF" w:sz="6"/>
               <w:left w:val="single" w:color="BFBFBF" w:sz="6"/>
@@ -4615,109 +3830,41 @@
                 <w:sz w:val="22"/>
                 <w:szCs w:val="22"/>
               </w:rPr>
-              <w:t xml:space="preserve">Студенты способны принять решение в условиях неполной информации</w:t>
-            </w:r>
-          </w:p>
-        </w:tc>
-        <w:tc>
-          <w:tcPr>
-            <w:tcW w:type="dxa" w:w="2300"/>
-            <w:tcBorders>
-              <w:top w:val="single" w:color="BFBFBF" w:sz="6"/>
-              <w:left w:val="single" w:color="BFBFBF" w:sz="6"/>
-              <w:bottom w:val="single" w:color="BFBFBF" w:sz="6"/>
-              <w:right w:val="single" w:color="BFBFBF" w:sz="6"/>
-            </w:tcBorders>
-            <w:tcMar>
-              <w:top w:type="dxa" w:w="70"/>
-              <w:left w:type="dxa" w:w="110"/>
-              <w:bottom w:type="dxa" w:w="70"/>
-              <w:right w:type="dxa" w:w="110"/>
-            </w:tcMar>
-            <w:vAlign w:val="center"/>
-          </w:tcPr>
-          <w:p>
-            <w:pPr>
-              <w:spacing w:after="50" w:line="264"/>
-              <w:jc w:val="left"/>
-            </w:pPr>
-            <w:r>
-              <w:rPr>
-                <w:rFonts w:ascii="Times New Roman" w:cs="Times New Roman" w:eastAsia="Times New Roman" w:hAnsi="Times New Roman"/>
-                <w:b w:val="false"/>
-                <w:bCs w:val="false"/>
-                <w:sz w:val="22"/>
-                <w:szCs w:val="22"/>
-              </w:rPr>
-              <w:t xml:space="preserve">Кейс-стади, деловая игра</w:t>
-            </w:r>
-          </w:p>
-        </w:tc>
-        <w:tc>
-          <w:tcPr>
-            <w:tcW w:type="dxa" w:w="2300"/>
-            <w:tcBorders>
-              <w:top w:val="single" w:color="BFBFBF" w:sz="6"/>
-              <w:left w:val="single" w:color="BFBFBF" w:sz="6"/>
-              <w:bottom w:val="single" w:color="BFBFBF" w:sz="6"/>
-              <w:right w:val="single" w:color="BFBFBF" w:sz="6"/>
-            </w:tcBorders>
-            <w:tcMar>
-              <w:top w:type="dxa" w:w="70"/>
-              <w:left w:type="dxa" w:w="110"/>
-              <w:bottom w:type="dxa" w:w="70"/>
-              <w:right w:type="dxa" w:w="110"/>
-            </w:tcMar>
-            <w:vAlign w:val="center"/>
-          </w:tcPr>
-          <w:p>
-            <w:pPr>
-              <w:spacing w:after="50" w:line="264"/>
-              <w:jc w:val="left"/>
-            </w:pPr>
-            <w:r>
-              <w:rPr>
-                <w:rFonts w:ascii="Times New Roman" w:cs="Times New Roman" w:eastAsia="Times New Roman" w:hAnsi="Times New Roman"/>
-                <w:b w:val="false"/>
-                <w:bCs w:val="false"/>
-                <w:sz w:val="22"/>
-                <w:szCs w:val="22"/>
-              </w:rPr>
-              <w:t xml:space="preserve">Практическое занятие в малых группах</w:t>
-            </w:r>
-          </w:p>
-        </w:tc>
-        <w:tc>
-          <w:tcPr>
-            <w:tcW w:type="dxa" w:w="2438"/>
-            <w:tcBorders>
-              <w:top w:val="single" w:color="BFBFBF" w:sz="6"/>
-              <w:left w:val="single" w:color="BFBFBF" w:sz="6"/>
-              <w:bottom w:val="single" w:color="BFBFBF" w:sz="6"/>
-              <w:right w:val="single" w:color="BFBFBF" w:sz="6"/>
-            </w:tcBorders>
-            <w:tcMar>
-              <w:top w:type="dxa" w:w="70"/>
-              <w:left w:type="dxa" w:w="110"/>
-              <w:bottom w:type="dxa" w:w="70"/>
-              <w:right w:type="dxa" w:w="110"/>
-            </w:tcMar>
-            <w:vAlign w:val="center"/>
-          </w:tcPr>
-          <w:p>
-            <w:pPr>
-              <w:spacing w:after="50" w:line="264"/>
-              <w:jc w:val="left"/>
-            </w:pPr>
-            <w:r>
-              <w:rPr>
-                <w:rFonts w:ascii="Times New Roman" w:cs="Times New Roman" w:eastAsia="Times New Roman" w:hAnsi="Times New Roman"/>
-                <w:b w:val="false"/>
-                <w:bCs w:val="false"/>
-                <w:sz w:val="22"/>
-                <w:szCs w:val="22"/>
-              </w:rPr>
-              <w:t xml:space="preserve">Текст кейса, роли, регламент</w:t>
+              <w:t xml:space="preserve">«Ок.» (на PR из 600 строк)</w:t>
+            </w:r>
+          </w:p>
+        </w:tc>
+        <w:tc>
+          <w:tcPr>
+            <w:tcW w:type="dxa" w:w="5838"/>
+            <w:tcBorders>
+              <w:top w:val="single" w:color="BFBFBF" w:sz="6"/>
+              <w:left w:val="single" w:color="BFBFBF" w:sz="6"/>
+              <w:bottom w:val="single" w:color="BFBFBF" w:sz="6"/>
+              <w:right w:val="single" w:color="BFBFBF" w:sz="6"/>
+            </w:tcBorders>
+            <w:tcMar>
+              <w:top w:type="dxa" w:w="70"/>
+              <w:left w:type="dxa" w:w="110"/>
+              <w:bottom w:type="dxa" w:w="70"/>
+              <w:right w:type="dxa" w:w="110"/>
+            </w:tcMar>
+            <w:vAlign w:val="center"/>
+          </w:tcPr>
+          <w:p>
+            <w:pPr>
+              <w:spacing w:after="50" w:line="264"/>
+              <w:jc w:val="left"/>
+            </w:pPr>
+            <w:r>
+              <w:rPr>
+                <w:rFonts w:ascii="Times New Roman" w:cs="Times New Roman" w:eastAsia="Times New Roman" w:hAnsi="Times New Roman"/>
+                <w:b w:val="false"/>
+                <w:bCs w:val="false"/>
+                <w:sz w:val="22"/>
+                <w:szCs w:val="22"/>
+              </w:rPr>
+              <w:t xml:space="preserve">PR слишком большой, чтобы проверить его качественно за разумное время. Предлагаю разбить на три: миграция схемы, изменение модели, новый API. Первую часть готов посмотреть сегодня.</w:t>
             </w:r>
           </w:p>
         </w:tc>
@@ -4788,7 +3935,7 @@
                 <w:sz w:val="24"/>
                 <w:szCs w:val="24"/>
               </w:rPr>
-              <w:t xml:space="preserve">Какую из пяти целей труднее всего достичь лекцией и почему?</w:t>
+              <w:t xml:space="preserve">Чем отличается замечание о дефекте от замечания о вкусе? Как обозначать второе, чтобы не блокировать слияние?</w:t>
             </w:r>
           </w:p>
           <w:p>
@@ -4802,7 +3949,7 @@
                 <w:sz w:val="24"/>
                 <w:szCs w:val="24"/>
               </w:rPr>
-              <w:t xml:space="preserve">Что изменится в выборе формы, если группа состоит из работающих магистрантов, которые могут присутствовать только вечером?</w:t>
+              <w:t xml:space="preserve">Что делать ревьюеру, если PR слишком большой для качественной проверки?</w:t>
             </w:r>
           </w:p>
           <w:p>
@@ -4816,7 +3963,7 @@
                 <w:sz w:val="24"/>
                 <w:szCs w:val="24"/>
               </w:rPr>
-              <w:t xml:space="preserve">Можно ли достичь цели «принять решение в условиях неполной информации» без активных методов?</w:t>
+              <w:t xml:space="preserve">Кто отвечает за тесты к изменению: автор, ревьюер или оба?</w:t>
             </w:r>
           </w:p>
         </w:tc>
@@ -4860,7 +4007,7 @@
           <w:sz w:val="26"/>
           <w:szCs w:val="26"/>
         </w:rPr>
-        <w:t xml:space="preserve">применить понятия темы для диагностики реальной педагогической ситуации и выработки обоснованного решения.</w:t>
+        <w:t xml:space="preserve">применить принципы контроля качества кода для диагностики ситуации в команде и выработки реализуемого процесса.</w:t>
       </w:r>
     </w:p>
     <w:tbl>
@@ -4909,7 +4056,7 @@
                 <w:sz w:val="24"/>
                 <w:szCs w:val="24"/>
               </w:rPr>
-              <w:t xml:space="preserve">Ситуация «Лекция, на которую никто не приходит»</w:t>
+              <w:t xml:space="preserve">Ситуация «Релиз, который откатили»</w:t>
             </w:r>
           </w:p>
           <w:p>
@@ -4923,7 +4070,7 @@
                 <w:sz w:val="24"/>
                 <w:szCs w:val="24"/>
               </w:rPr>
-              <w:t xml:space="preserve">Доцент кафедры информационных систем ведёт у магистрантов первого курса дисциплину «Методы анализа данных». По учебному плану на дисциплину отведено 15 лекций и 15 практических занятий. Все лекции проводятся по понедельникам в 9:00 в традиционном формате: преподаватель читает материал по слайдам, студенты конспектируют. Практические занятия ведёт ассистент по сборнику типовых задач: студенты решают задачи по образцу, разобранному на доске.</w:t>
+              <w:t xml:space="preserve">Команда из 6 разработчиков делает веб-сервис для онлайн-записи к врачам. Заказчик требует новые функции каждые две недели. Code review в команде формально есть: pull request нельзя слить без одного одобрения, но одобрение обычно ставится за 2–3 минуты с комментарием «ок» или «LGTM». Pull request в среднем содержит 400–800 строк, иногда до 2 000. Автотесты есть только у модуля оплаты, их написал разработчик, который уволился полгода назад. Непрерывная интеграция (CI) настроена, но прогоняет только линтер, и его предупреждения давно никто не читает: их около 1 400.</w:t>
             </w:r>
           </w:p>
           <w:p>
@@ -4937,7 +4084,7 @@
                 <w:sz w:val="24"/>
                 <w:szCs w:val="24"/>
               </w:rPr>
-              <w:t xml:space="preserve">В группе 18 магистрантов, из них 15 работают, 9 из них на полную ставку. К четвёртой неделе на лекции приходят 4–6 человек, на практические занятия 8–10. Старосте группы студенты говорят: «Всё это есть в учебнике и в записи на YouTube», «Задачи из сборника не похожи на то, что мы делаем на работе», «Непонятно, зачем нам это, если диссертация по другой теме».</w:t>
+              <w:t xml:space="preserve">В пятницу вечером команда выпустила релиз 3.4 с новой функцией переноса записи. В субботу утром выяснилось, что при переносе записи старый слот не освобождается, и за ночь 212 пациентов не смогли записаться. Релиз откатили, двое разработчиков провели выходные за исправлением. Причина оказалась в условии, которое не выполнялось для слотов, созданных до миграции базы. Ревьюер, одобривший PR, сказал: «Там было 1 100 строк, я посмотрел общую логику, дальше доверился автору».</w:t>
             </w:r>
           </w:p>
           <w:p>
@@ -4951,7 +4098,7 @@
                 <w:sz w:val="24"/>
                 <w:szCs w:val="24"/>
               </w:rPr>
-              <w:t xml:space="preserve">Преподаватель предложил ввести обязательную отметку посещаемости и допуск к экзамену при посещении не менее 70% занятий. После этого посещаемость лекций выросла до 10–12 человек, но студенты сидят с ноутбуками и занимаются рабочими задачами. Результаты первого рубежного контроля: средний балл 54 из 100, при этом трое работающих в аналитических отделах студентов получили 90+, не посещая лекций.</w:t>
+              <w:t xml:space="preserve">Тимлид предложил два решения: нанять отдельного QA-инженера и запретить релизы по пятницам. Разработчики считают, что проблема не в дне недели, а в том, что «ревью никто не делает по-настоящему, потому что некогда». Заказчик требует гарантий, что ситуация не повторится, но не готов замедлять выпуск функций.</w:t>
             </w:r>
           </w:p>
           <w:p>
@@ -4965,7 +4112,7 @@
                 <w:sz w:val="24"/>
                 <w:szCs w:val="24"/>
               </w:rPr>
-              <w:t xml:space="preserve">Заведующий кафедрой попросил преподавателя подготовить предложения по изменению методов и форм организации обучения по дисциплине к следующему семестру.</w:t>
+              <w:t xml:space="preserve">Руководитель разработки попросил команду за неделю подготовить предложения по процессу контроля качества кода, которые можно внедрить без расширения штата.</w:t>
             </w:r>
           </w:p>
         </w:tc>
@@ -5008,7 +4155,7 @@
           <w:sz w:val="26"/>
           <w:szCs w:val="26"/>
         </w:rPr>
-        <w:t xml:space="preserve">Опишите ситуацию в терминах темы: какие методы, формы и средства использует преподаватель сейчас? Какие приёмы? На какую цель они реально работают?</w:t>
+        <w:t xml:space="preserve">Опишите текущий процесс контроля качества: какие практики есть формально, какие работают фактически? Где именно дефект должен был быть пойман и почему не был?</w:t>
       </w:r>
     </w:p>
     <w:p>
@@ -5027,7 +4174,7 @@
           <w:sz w:val="26"/>
           <w:szCs w:val="26"/>
         </w:rPr>
-        <w:t xml:space="preserve">Назовите причины низкой посещаемости и низких результатов. Разделите их на те, что связаны с выбором метода, с выбором формы, со средствами и с условиями (состав группы).</w:t>
+        <w:t xml:space="preserve">Назовите причины инцидента. Разделите их на процессные (как организована работа), технические (код, тесты, CI) и культурные (отношение к ревью).</w:t>
       </w:r>
     </w:p>
     <w:p>
@@ -5046,7 +4193,7 @@
           <w:sz w:val="26"/>
           <w:szCs w:val="26"/>
         </w:rPr>
-        <w:t xml:space="preserve">Почему мера «обязательная посещаемость» не дала результата? Какой тип мотивации она задействует?</w:t>
+        <w:t xml:space="preserve">Оцените предложения тимлида: нанять QA и запретить пятничные релизы. Какую из причин они устраняют, а какую нет?</w:t>
       </w:r>
     </w:p>
     <w:p>
@@ -5065,7 +4212,7 @@
           <w:sz w:val="26"/>
           <w:szCs w:val="26"/>
         </w:rPr>
-        <w:t xml:space="preserve">Предложите не менее трёх изменений в методах и формах занятий. Для каждого укажите: какую цель оно решает, какой метод и форму предполагает, какое средство нужно, какой результат ожидается.</w:t>
+        <w:t xml:space="preserve">Предложите не менее четырёх изменений в процессе. Для каждого укажите: какую причину оно устраняет, что конкретно меняется, сколько времени команды стоит и как проверить, что оно работает.</w:t>
       </w:r>
     </w:p>
     <w:p>
@@ -5084,7 +4231,7 @@
           <w:sz w:val="26"/>
           <w:szCs w:val="26"/>
         </w:rPr>
-        <w:t xml:space="preserve">Что из предложенного можно внедрить без изменения учебного плана и расписания, а что требует согласования с кафедрой?</w:t>
+        <w:t xml:space="preserve">Что можно внедрить на следующей неделе силами команды, а что требует согласования с заказчиком (например, снижение скорости выпуска на один спринт)?</w:t>
       </w:r>
     </w:p>
     <w:p>
@@ -5125,7 +4272,7 @@
           <w:sz w:val="26"/>
           <w:szCs w:val="26"/>
         </w:rPr>
-        <w:t xml:space="preserve">Используются объяснительно-иллюстративный и репродуктивный методы в формах лекции и практического занятия по сборнику. Средства: слайды и задачник. Приёмов активизации нет. Фактическая цель, на которую работает такое занятие, это воспроизведение материала, а не умение анализировать данные.</w:t>
+        <w:t xml:space="preserve">Ревью существует как формальный барьер, а не как проверка. CI не защищает: линтер без порога, тесты покрывают один модуль. Дефект (условие для старых слотов) мог быть пойман трижды: тестом на данные до миграции, внимательным ревью или ручной проверкой сценария переноса, и ни один рубеж не сработал.</w:t>
       </w:r>
     </w:p>
     <w:p>
@@ -5149,7 +4296,7 @@
           <w:sz w:val="26"/>
           <w:szCs w:val="26"/>
         </w:rPr>
-        <w:t xml:space="preserve">(1) Метод: пассивное изложение материала, который доступен в учебнике и в записи, не создаёт ценности присутствия. (2) Форма: утренняя лекция в будний день несовместима с занятостью 15 из 18 студентов. (3) Средства: задачи из сборника не связаны с реальными данными и с работой студентов, нарушена значимость (ARCS: Relevance). (4) Условия: группа разнородна по опыту, трое студентов уже владеют материалом, для них занятия избыточны, для остальных недостаточно практики.</w:t>
+        <w:t xml:space="preserve">(1) Процессные: PR по 1 000 строк невозможно проверить качественно; нет Definition of Done, где тесты обязательны; релиз без проверки на данных, похожих на боевые. (2) Технические: нет автотестов на критичный модуль записи; CI не блокирует слияние; 1 400 предупреждений линтера обесценили сам инструмент. (3) Культурные: ревью воспринимается как формальность и помеха скорости, одобрение ставится «из доверия»; ответственность за качество размыта.</w:t>
       </w:r>
     </w:p>
     <w:p>
@@ -5165,7 +4312,7 @@
           <w:sz w:val="26"/>
           <w:szCs w:val="26"/>
         </w:rPr>
-        <w:t xml:space="preserve">Почему не сработал контроль посещаемости. </w:t>
+        <w:t xml:space="preserve">Оценка предложений тимлида. </w:t>
       </w:r>
       <w:r>
         <w:rPr>
@@ -5173,7 +4320,7 @@
           <w:sz w:val="26"/>
           <w:szCs w:val="26"/>
         </w:rPr>
-        <w:t xml:space="preserve">Это внешний стимул, он меняет поведение (присутствие), но не вовлечённость. Студент приходит телом, а не вниманием. Проблема не в дисциплине, а в том, что занятие не отвечает на вопрос «зачем».</w:t>
+        <w:t xml:space="preserve">Отдельный QA не решает проблему больших PR и отсутствия тестов, он лишь добавляет ещё один рубеж, который будет перегружен. Запрет пятничных релизов снижает цену инцидента (есть кому чинить), но не его вероятность. Оба предложения лечат симптом.</w:t>
       </w:r>
     </w:p>
     <w:p>
@@ -5208,7 +4355,7 @@
           <w:sz w:val="26"/>
           <w:szCs w:val="26"/>
         </w:rPr>
-        <w:t xml:space="preserve">Перевернуть лекцию: теория в записи и конспекте для самостоятельного изучения, очное время на проблемную лекцию с разбором вопросов студентов. Метод: проблемное изложение; форма: лекция-консультация; средство: видеозапись и тест для самопроверки.</w:t>
+        <w:t xml:space="preserve">Ограничить размер PR: не более 300–400 строк, крупные задачи дробятся заранее. Устраняет причину «нечитаемое ревью». Стоимость: планирование декомпозиции. Проверка: медиана размера PR за спринт.</w:t>
       </w:r>
     </w:p>
     <w:p>
@@ -5227,7 +4374,7 @@
           <w:sz w:val="26"/>
           <w:szCs w:val="26"/>
         </w:rPr>
-        <w:t xml:space="preserve">Заменить задачи из сборника на кейсы с реальными данными, в том числе с данными работодателей студентов. Метод: кейс-стади, проектный; форма: практикум в малых группах; средство: открытые датасеты, шаблон отчёта.</w:t>
+        <w:t xml:space="preserve">Ввести Definition of Done: PR не сливается без тестов на изменённую логику и без прохождения CI. Устраняет отсутствие тестов на новые изменения. Стоимость: плюс 15–20% времени на задачу. Проверка: доля PR с тестами.</w:t>
       </w:r>
     </w:p>
     <w:p>
@@ -5246,7 +4393,7 @@
           <w:sz w:val="26"/>
           <w:szCs w:val="26"/>
         </w:rPr>
-        <w:t xml:space="preserve">Ввести дифференциацию: студенты с опытом получают роль консультантов или усложнённый проект вместо базовых задач. Метод: взаимное обучение; форма: групповая работа; средство: рубрика оценки проекта.</w:t>
+        <w:t xml:space="preserve">Сделать CI блокирующим: тесты обязательны, линтер с порогом «не хуже, чем было» (ratchet), старые предупреждения закрываются по 50 в спринт. Устраняет бесполезный CI. Стоимость: 1–2 дня настройки. Проверка: число предупреждений по спринтам.</w:t>
       </w:r>
     </w:p>
     <w:p>
@@ -5265,7 +4412,7 @@
           <w:sz w:val="26"/>
           <w:szCs w:val="26"/>
         </w:rPr>
-        <w:t xml:space="preserve">Согласовать с кафедрой перенос части занятий на вечернее время или в блочный формат, а часть часов перевести в управляемую СРС с онлайн-консультациями.</w:t>
+        <w:t xml:space="preserve">Чек-лист ревью из 6–8 пунктов (граничные случаи, миграции, данные до и после, откат) и правило: ревьюер пишет, что именно проверил. Устраняет формальное «LGTM». Стоимость: 10–20 минут на ревью. Проверка: число замечаний на PR, число дефектов после релиза.</w:t>
       </w:r>
     </w:p>
     <w:p>
@@ -5284,7 +4431,26 @@
           <w:sz w:val="26"/>
           <w:szCs w:val="26"/>
         </w:rPr>
-        <w:t xml:space="preserve">Заменить контроль посещаемости на контроль результата: оценка за проект и рубежные работы, посещение свободное.</w:t>
+        <w:t xml:space="preserve">Написать тесты на модуль записи и переноса в первую очередь, как на самый рискованный. Устраняет техническую причину инцидента. Стоимость: 3–5 дней одного разработчика. Проверка: покрытие критичного модуля.</w:t>
+      </w:r>
+    </w:p>
+    <w:p>
+      <w:pPr>
+        <w:pStyle w:val="ListParagraph"/>
+        <w:numPr>
+          <w:ilvl w:val="0"/>
+          <w:numId w:val="3"/>
+        </w:numPr>
+        <w:spacing w:after="100" w:line="276"/>
+        <w:jc w:val="left"/>
+      </w:pPr>
+      <w:r>
+        <w:rPr>
+          <w:rFonts w:ascii="Times New Roman" w:cs="Times New Roman" w:eastAsia="Times New Roman" w:hAnsi="Times New Roman"/>
+          <w:sz w:val="26"/>
+          <w:szCs w:val="26"/>
+        </w:rPr>
+        <w:t xml:space="preserve">Пробный прогон релиза на копии боевой базы перед выпуском. Устраняет пропуск дефектов на «старых» данных. Стоимость: 1 час на релиз. Проверка: число откатов.</w:t>
       </w:r>
     </w:p>
     <w:p>
@@ -5300,7 +4466,7 @@
           <w:sz w:val="26"/>
           <w:szCs w:val="26"/>
         </w:rPr>
-        <w:t xml:space="preserve">Без изменения учебного плана: </w:t>
+        <w:t xml:space="preserve">На следующей неделе силами команды: </w:t>
       </w:r>
       <w:r>
         <w:rPr>
@@ -5308,7 +4474,7 @@
           <w:sz w:val="26"/>
           <w:szCs w:val="26"/>
         </w:rPr>
-        <w:t xml:space="preserve">пункты 1, 2, 3, 5. </w:t>
+        <w:t xml:space="preserve">пункты 1, 3, 4, 6. </w:t>
       </w:r>
       <w:r>
         <w:rPr>
@@ -5318,7 +4484,7 @@
           <w:sz w:val="26"/>
           <w:szCs w:val="26"/>
         </w:rPr>
-        <w:t xml:space="preserve">Требует согласования: </w:t>
+        <w:t xml:space="preserve">Требует согласования с заказчиком: </w:t>
       </w:r>
       <w:r>
         <w:rPr>
@@ -5326,7 +4492,7 @@
           <w:sz w:val="26"/>
           <w:szCs w:val="26"/>
         </w:rPr>
-        <w:t xml:space="preserve">пункт 4 (расписание и соотношение аудиторных часов и СРС).</w:t>
+        <w:t xml:space="preserve">пункты 2 и 5, так как замедляют выпуск на один-два спринта. Аргумент для заказчика: цена инцидента (212 потерянных записей и выходные двух разработчиков) выше цены одного спринта на тесты.</w:t>
       </w:r>
     </w:p>
     <w:p>
@@ -5595,7 +4761,7 @@
                 <w:sz w:val="22"/>
                 <w:szCs w:val="22"/>
               </w:rPr>
-              <w:t xml:space="preserve">Названы все 4 причины, с опорой на понятия темы</w:t>
+              <w:t xml:space="preserve">Названы все 4 причины, разделены процессные и технические</w:t>
             </w:r>
           </w:p>
         </w:tc>
@@ -5738,7 +4904,7 @@
                 <w:sz w:val="22"/>
                 <w:szCs w:val="22"/>
               </w:rPr>
-              <w:t xml:space="preserve">Каждая мера связана с целью и условиями</w:t>
+              <w:t xml:space="preserve">Каждая мера связана с конкретной причиной и измерима</w:t>
             </w:r>
           </w:p>
         </w:tc>
@@ -5773,7 +4939,7 @@
                 <w:sz w:val="22"/>
                 <w:szCs w:val="22"/>
               </w:rPr>
-              <w:t xml:space="preserve">Меры уместны, но связь с целью частична</w:t>
+              <w:t xml:space="preserve">Меры уместны, но связь с причинами частична</w:t>
             </w:r>
           </w:p>
         </w:tc>
@@ -5847,7 +5013,7 @@
                 <w:sz w:val="22"/>
                 <w:szCs w:val="22"/>
               </w:rPr>
-              <w:t xml:space="preserve">Использование понятий</w:t>
+              <w:t xml:space="preserve">Инженерная корректность</w:t>
             </w:r>
           </w:p>
         </w:tc>
@@ -5881,7 +5047,7 @@
                 <w:sz w:val="22"/>
                 <w:szCs w:val="22"/>
               </w:rPr>
-              <w:t xml:space="preserve">Метод, приём, средство, форма различаются верно</w:t>
+              <w:t xml:space="preserve">Предложенный процесс реализуем, учтены стоимость и сопротивление команды</w:t>
             </w:r>
           </w:p>
         </w:tc>
@@ -5915,7 +5081,7 @@
                 <w:sz w:val="22"/>
                 <w:szCs w:val="22"/>
               </w:rPr>
-              <w:t xml:space="preserve">Есть 1–2 смешения</w:t>
+              <w:t xml:space="preserve">Есть 1–2 нереалистичных пункта</w:t>
             </w:r>
           </w:p>
         </w:tc>
@@ -5949,7 +5115,7 @@
                 <w:sz w:val="22"/>
                 <w:szCs w:val="22"/>
               </w:rPr>
-              <w:t xml:space="preserve">Понятия смешаны</w:t>
+              <w:t xml:space="preserve">Процесс нереализуем</w:t>
             </w:r>
           </w:p>
         </w:tc>
@@ -6138,7 +5304,7 @@
           <w:sz w:val="26"/>
           <w:szCs w:val="26"/>
         </w:rPr>
-        <w:t xml:space="preserve">каждый студент записывает три вывода, которые сделал на занятии, два вопроса, которые остались, и одно изменение, которое внесёт в собственное занятие или выступление.</w:t>
+        <w:t xml:space="preserve">каждый студент записывает три вывода, которые сделал на занятии, два вопроса, которые остались, и одно изменение, которое внесёт в свою практику ревью или написания кода.</w:t>
       </w:r>
     </w:p>
     <w:p>
@@ -6154,7 +5320,7 @@
           <w:sz w:val="26"/>
           <w:szCs w:val="26"/>
         </w:rPr>
-        <w:t xml:space="preserve">Домашнее задание: </w:t>
+        <w:t xml:space="preserve">Домашнее задание (СРС, 4 часа): </w:t>
       </w:r>
       <w:r>
         <w:rPr>
@@ -6162,7 +5328,7 @@
           <w:sz w:val="26"/>
           <w:szCs w:val="26"/>
         </w:rPr>
-        <w:t xml:space="preserve">составить схему «цель занятия → метод → форма работы» для одной темы своей дисциплины (объём 1–2 страницы, с обоснованием выбора в 3–5 предложениях). Срок: к следующему занятию.</w:t>
+        <w:t xml:space="preserve">провести ревью одного pull request в репозитории своего курсового проекта или проекта одногруппника по чек-листу с занятия. Оформить не менее пяти замечаний по правилу «факт, последствие, предложение», одно из них пометить как nit. Сдать ссылку на PR с комментариями. Срок: к следующему занятию.</w:t>
       </w:r>
     </w:p>
     <w:p>
@@ -6179,8 +5345,767 @@
           <w:sz w:val="30"/>
           <w:szCs w:val="30"/>
         </w:rPr>
-        <w:t xml:space="preserve">8. Используемые понятия</w:t>
-      </w:r>
+        <w:t xml:space="preserve">8. Связь занятия с темой «Методы и формы организации обучения в высшей школе»</w:t>
+      </w:r>
+    </w:p>
+    <w:p>
+      <w:pPr>
+        <w:spacing w:after="100" w:line="276"/>
+        <w:jc w:val="both"/>
+      </w:pPr>
+      <w:r>
+        <w:rPr>
+          <w:rFonts w:ascii="Times New Roman" w:cs="Times New Roman" w:eastAsia="Times New Roman" w:hAnsi="Times New Roman"/>
+          <w:sz w:val="26"/>
+          <w:szCs w:val="26"/>
+        </w:rPr>
+        <w:t xml:space="preserve">Занятие спроектировано по схеме «цель этапа → метод → форма → средство». Выбор активных методов (упражнение, кейс-стади, взаимооценка) обусловлен тем, что целью является не знание о ревью, а умение его проводить и организовывать.</w:t>
+      </w:r>
+    </w:p>
+    <w:tbl>
+      <w:tblPr>
+        <w:tblW w:type="dxa" w:w="9638"/>
+        <w:tblBorders>
+          <w:top w:val="single" w:color="auto" w:sz="4"/>
+          <w:left w:val="single" w:color="auto" w:sz="4"/>
+          <w:bottom w:val="single" w:color="auto" w:sz="4"/>
+          <w:right w:val="single" w:color="auto" w:sz="4"/>
+          <w:insideH w:val="single" w:color="auto" w:sz="4"/>
+          <w:insideV w:val="single" w:color="auto" w:sz="4"/>
+        </w:tblBorders>
+      </w:tblPr>
+      <w:tblGrid>
+        <w:gridCol w:w="2500"/>
+        <w:gridCol w:w="2300"/>
+        <w:gridCol w:w="2300"/>
+        <w:gridCol w:w="2538"/>
+      </w:tblGrid>
+      <w:tr>
+        <w:trPr>
+          <w:tblHeader/>
+        </w:trPr>
+        <w:tc>
+          <w:tcPr>
+            <w:tcW w:type="dxa" w:w="2500"/>
+            <w:tcBorders>
+              <w:top w:val="single" w:color="BFBFBF" w:sz="6"/>
+              <w:left w:val="single" w:color="BFBFBF" w:sz="6"/>
+              <w:bottom w:val="single" w:color="BFBFBF" w:sz="6"/>
+              <w:right w:val="single" w:color="BFBFBF" w:sz="6"/>
+            </w:tcBorders>
+            <w:shd w:fill="1B2A41" w:color="auto" w:val="clear"/>
+            <w:tcMar>
+              <w:top w:type="dxa" w:w="70"/>
+              <w:left w:type="dxa" w:w="110"/>
+              <w:bottom w:type="dxa" w:w="70"/>
+              <w:right w:type="dxa" w:w="110"/>
+            </w:tcMar>
+            <w:vAlign w:val="center"/>
+          </w:tcPr>
+          <w:p>
+            <w:pPr>
+              <w:spacing w:after="50" w:line="264"/>
+              <w:jc w:val="left"/>
+            </w:pPr>
+            <w:r>
+              <w:rPr>
+                <w:rFonts w:ascii="Times New Roman" w:cs="Times New Roman" w:eastAsia="Times New Roman" w:hAnsi="Times New Roman"/>
+                <w:b/>
+                <w:bCs/>
+                <w:color w:val="FFFFFF"/>
+                <w:sz w:val="22"/>
+                <w:szCs w:val="22"/>
+              </w:rPr>
+              <w:t xml:space="preserve">Цель этапа</w:t>
+            </w:r>
+          </w:p>
+        </w:tc>
+        <w:tc>
+          <w:tcPr>
+            <w:tcW w:type="dxa" w:w="2300"/>
+            <w:tcBorders>
+              <w:top w:val="single" w:color="BFBFBF" w:sz="6"/>
+              <w:left w:val="single" w:color="BFBFBF" w:sz="6"/>
+              <w:bottom w:val="single" w:color="BFBFBF" w:sz="6"/>
+              <w:right w:val="single" w:color="BFBFBF" w:sz="6"/>
+            </w:tcBorders>
+            <w:shd w:fill="1B2A41" w:color="auto" w:val="clear"/>
+            <w:tcMar>
+              <w:top w:type="dxa" w:w="70"/>
+              <w:left w:type="dxa" w:w="110"/>
+              <w:bottom w:type="dxa" w:w="70"/>
+              <w:right w:type="dxa" w:w="110"/>
+            </w:tcMar>
+            <w:vAlign w:val="center"/>
+          </w:tcPr>
+          <w:p>
+            <w:pPr>
+              <w:spacing w:after="50" w:line="264"/>
+              <w:jc w:val="left"/>
+            </w:pPr>
+            <w:r>
+              <w:rPr>
+                <w:rFonts w:ascii="Times New Roman" w:cs="Times New Roman" w:eastAsia="Times New Roman" w:hAnsi="Times New Roman"/>
+                <w:b/>
+                <w:bCs/>
+                <w:color w:val="FFFFFF"/>
+                <w:sz w:val="22"/>
+                <w:szCs w:val="22"/>
+              </w:rPr>
+              <w:t xml:space="preserve">Метод</w:t>
+            </w:r>
+          </w:p>
+        </w:tc>
+        <w:tc>
+          <w:tcPr>
+            <w:tcW w:type="dxa" w:w="2300"/>
+            <w:tcBorders>
+              <w:top w:val="single" w:color="BFBFBF" w:sz="6"/>
+              <w:left w:val="single" w:color="BFBFBF" w:sz="6"/>
+              <w:bottom w:val="single" w:color="BFBFBF" w:sz="6"/>
+              <w:right w:val="single" w:color="BFBFBF" w:sz="6"/>
+            </w:tcBorders>
+            <w:shd w:fill="1B2A41" w:color="auto" w:val="clear"/>
+            <w:tcMar>
+              <w:top w:type="dxa" w:w="70"/>
+              <w:left w:type="dxa" w:w="110"/>
+              <w:bottom w:type="dxa" w:w="70"/>
+              <w:right w:type="dxa" w:w="110"/>
+            </w:tcMar>
+            <w:vAlign w:val="center"/>
+          </w:tcPr>
+          <w:p>
+            <w:pPr>
+              <w:spacing w:after="50" w:line="264"/>
+              <w:jc w:val="left"/>
+            </w:pPr>
+            <w:r>
+              <w:rPr>
+                <w:rFonts w:ascii="Times New Roman" w:cs="Times New Roman" w:eastAsia="Times New Roman" w:hAnsi="Times New Roman"/>
+                <w:b/>
+                <w:bCs/>
+                <w:color w:val="FFFFFF"/>
+                <w:sz w:val="22"/>
+                <w:szCs w:val="22"/>
+              </w:rPr>
+              <w:t xml:space="preserve">Форма</w:t>
+            </w:r>
+          </w:p>
+        </w:tc>
+        <w:tc>
+          <w:tcPr>
+            <w:tcW w:type="dxa" w:w="2538"/>
+            <w:tcBorders>
+              <w:top w:val="single" w:color="BFBFBF" w:sz="6"/>
+              <w:left w:val="single" w:color="BFBFBF" w:sz="6"/>
+              <w:bottom w:val="single" w:color="BFBFBF" w:sz="6"/>
+              <w:right w:val="single" w:color="BFBFBF" w:sz="6"/>
+            </w:tcBorders>
+            <w:shd w:fill="1B2A41" w:color="auto" w:val="clear"/>
+            <w:tcMar>
+              <w:top w:type="dxa" w:w="70"/>
+              <w:left w:type="dxa" w:w="110"/>
+              <w:bottom w:type="dxa" w:w="70"/>
+              <w:right w:type="dxa" w:w="110"/>
+            </w:tcMar>
+            <w:vAlign w:val="center"/>
+          </w:tcPr>
+          <w:p>
+            <w:pPr>
+              <w:spacing w:after="50" w:line="264"/>
+              <w:jc w:val="left"/>
+            </w:pPr>
+            <w:r>
+              <w:rPr>
+                <w:rFonts w:ascii="Times New Roman" w:cs="Times New Roman" w:eastAsia="Times New Roman" w:hAnsi="Times New Roman"/>
+                <w:b/>
+                <w:bCs/>
+                <w:color w:val="FFFFFF"/>
+                <w:sz w:val="22"/>
+                <w:szCs w:val="22"/>
+              </w:rPr>
+              <w:t xml:space="preserve">Средство</w:t>
+            </w:r>
+          </w:p>
+        </w:tc>
+      </w:tr>
+      <w:tr>
+        <w:trPr>
+          <w:cantSplit/>
+        </w:trPr>
+        <w:tc>
+          <w:tcPr>
+            <w:tcW w:type="dxa" w:w="2500"/>
+            <w:tcBorders>
+              <w:top w:val="single" w:color="BFBFBF" w:sz="6"/>
+              <w:left w:val="single" w:color="BFBFBF" w:sz="6"/>
+              <w:bottom w:val="single" w:color="BFBFBF" w:sz="6"/>
+              <w:right w:val="single" w:color="BFBFBF" w:sz="6"/>
+            </w:tcBorders>
+            <w:tcMar>
+              <w:top w:type="dxa" w:w="70"/>
+              <w:left w:type="dxa" w:w="110"/>
+              <w:bottom w:type="dxa" w:w="70"/>
+              <w:right w:type="dxa" w:w="110"/>
+            </w:tcMar>
+            <w:vAlign w:val="center"/>
+          </w:tcPr>
+          <w:p>
+            <w:pPr>
+              <w:spacing w:after="50" w:line="264"/>
+              <w:jc w:val="left"/>
+            </w:pPr>
+            <w:r>
+              <w:rPr>
+                <w:rFonts w:ascii="Times New Roman" w:cs="Times New Roman" w:eastAsia="Times New Roman" w:hAnsi="Times New Roman"/>
+                <w:b/>
+                <w:bCs/>
+                <w:sz w:val="22"/>
+                <w:szCs w:val="22"/>
+              </w:rPr>
+              <w:t xml:space="preserve">Знать виды дефектов и принципы ревью</w:t>
+            </w:r>
+          </w:p>
+        </w:tc>
+        <w:tc>
+          <w:tcPr>
+            <w:tcW w:type="dxa" w:w="2300"/>
+            <w:tcBorders>
+              <w:top w:val="single" w:color="BFBFBF" w:sz="6"/>
+              <w:left w:val="single" w:color="BFBFBF" w:sz="6"/>
+              <w:bottom w:val="single" w:color="BFBFBF" w:sz="6"/>
+              <w:right w:val="single" w:color="BFBFBF" w:sz="6"/>
+            </w:tcBorders>
+            <w:tcMar>
+              <w:top w:type="dxa" w:w="70"/>
+              <w:left w:type="dxa" w:w="110"/>
+              <w:bottom w:type="dxa" w:w="70"/>
+              <w:right w:type="dxa" w:w="110"/>
+            </w:tcMar>
+            <w:vAlign w:val="center"/>
+          </w:tcPr>
+          <w:p>
+            <w:pPr>
+              <w:spacing w:after="50" w:line="264"/>
+              <w:jc w:val="left"/>
+            </w:pPr>
+            <w:r>
+              <w:rPr>
+                <w:rFonts w:ascii="Times New Roman" w:cs="Times New Roman" w:eastAsia="Times New Roman" w:hAnsi="Times New Roman"/>
+                <w:b w:val="false"/>
+                <w:bCs w:val="false"/>
+                <w:sz w:val="22"/>
+                <w:szCs w:val="22"/>
+              </w:rPr>
+              <w:t xml:space="preserve">Беседа, упражнение (репродуктивный, частично-поисковый)</w:t>
+            </w:r>
+          </w:p>
+        </w:tc>
+        <w:tc>
+          <w:tcPr>
+            <w:tcW w:type="dxa" w:w="2300"/>
+            <w:tcBorders>
+              <w:top w:val="single" w:color="BFBFBF" w:sz="6"/>
+              <w:left w:val="single" w:color="BFBFBF" w:sz="6"/>
+              <w:bottom w:val="single" w:color="BFBFBF" w:sz="6"/>
+              <w:right w:val="single" w:color="BFBFBF" w:sz="6"/>
+            </w:tcBorders>
+            <w:tcMar>
+              <w:top w:type="dxa" w:w="70"/>
+              <w:left w:type="dxa" w:w="110"/>
+              <w:bottom w:type="dxa" w:w="70"/>
+              <w:right w:type="dxa" w:w="110"/>
+            </w:tcMar>
+            <w:vAlign w:val="center"/>
+          </w:tcPr>
+          <w:p>
+            <w:pPr>
+              <w:spacing w:after="50" w:line="264"/>
+              <w:jc w:val="left"/>
+            </w:pPr>
+            <w:r>
+              <w:rPr>
+                <w:rFonts w:ascii="Times New Roman" w:cs="Times New Roman" w:eastAsia="Times New Roman" w:hAnsi="Times New Roman"/>
+                <w:b w:val="false"/>
+                <w:bCs w:val="false"/>
+                <w:sz w:val="22"/>
+                <w:szCs w:val="22"/>
+              </w:rPr>
+              <w:t xml:space="preserve">Практическое занятие, индивидуальная работа</w:t>
+            </w:r>
+          </w:p>
+        </w:tc>
+        <w:tc>
+          <w:tcPr>
+            <w:tcW w:type="dxa" w:w="2538"/>
+            <w:tcBorders>
+              <w:top w:val="single" w:color="BFBFBF" w:sz="6"/>
+              <w:left w:val="single" w:color="BFBFBF" w:sz="6"/>
+              <w:bottom w:val="single" w:color="BFBFBF" w:sz="6"/>
+              <w:right w:val="single" w:color="BFBFBF" w:sz="6"/>
+            </w:tcBorders>
+            <w:tcMar>
+              <w:top w:type="dxa" w:w="70"/>
+              <w:left w:type="dxa" w:w="110"/>
+              <w:bottom w:type="dxa" w:w="70"/>
+              <w:right w:type="dxa" w:w="110"/>
+            </w:tcMar>
+            <w:vAlign w:val="center"/>
+          </w:tcPr>
+          <w:p>
+            <w:pPr>
+              <w:spacing w:after="50" w:line="264"/>
+              <w:jc w:val="left"/>
+            </w:pPr>
+            <w:r>
+              <w:rPr>
+                <w:rFonts w:ascii="Times New Roman" w:cs="Times New Roman" w:eastAsia="Times New Roman" w:hAnsi="Times New Roman"/>
+                <w:b w:val="false"/>
+                <w:bCs w:val="false"/>
+                <w:sz w:val="22"/>
+                <w:szCs w:val="22"/>
+              </w:rPr>
+              <w:t xml:space="preserve">Листы с фрагментами кода, ключ</w:t>
+            </w:r>
+          </w:p>
+        </w:tc>
+      </w:tr>
+      <w:tr>
+        <w:trPr>
+          <w:cantSplit/>
+        </w:trPr>
+        <w:tc>
+          <w:tcPr>
+            <w:tcW w:type="dxa" w:w="2500"/>
+            <w:tcBorders>
+              <w:top w:val="single" w:color="BFBFBF" w:sz="6"/>
+              <w:left w:val="single" w:color="BFBFBF" w:sz="6"/>
+              <w:bottom w:val="single" w:color="BFBFBF" w:sz="6"/>
+              <w:right w:val="single" w:color="BFBFBF" w:sz="6"/>
+            </w:tcBorders>
+            <w:shd w:fill="F2EFE6" w:color="auto" w:val="clear"/>
+            <w:tcMar>
+              <w:top w:type="dxa" w:w="70"/>
+              <w:left w:type="dxa" w:w="110"/>
+              <w:bottom w:type="dxa" w:w="70"/>
+              <w:right w:type="dxa" w:w="110"/>
+            </w:tcMar>
+            <w:vAlign w:val="center"/>
+          </w:tcPr>
+          <w:p>
+            <w:pPr>
+              <w:spacing w:after="50" w:line="264"/>
+              <w:jc w:val="left"/>
+            </w:pPr>
+            <w:r>
+              <w:rPr>
+                <w:rFonts w:ascii="Times New Roman" w:cs="Times New Roman" w:eastAsia="Times New Roman" w:hAnsi="Times New Roman"/>
+                <w:b/>
+                <w:bCs/>
+                <w:sz w:val="22"/>
+                <w:szCs w:val="22"/>
+              </w:rPr>
+              <w:t xml:space="preserve">Уметь формулировать конструктивное замечание</w:t>
+            </w:r>
+          </w:p>
+        </w:tc>
+        <w:tc>
+          <w:tcPr>
+            <w:tcW w:type="dxa" w:w="2300"/>
+            <w:tcBorders>
+              <w:top w:val="single" w:color="BFBFBF" w:sz="6"/>
+              <w:left w:val="single" w:color="BFBFBF" w:sz="6"/>
+              <w:bottom w:val="single" w:color="BFBFBF" w:sz="6"/>
+              <w:right w:val="single" w:color="BFBFBF" w:sz="6"/>
+            </w:tcBorders>
+            <w:shd w:fill="F2EFE6" w:color="auto" w:val="clear"/>
+            <w:tcMar>
+              <w:top w:type="dxa" w:w="70"/>
+              <w:left w:type="dxa" w:w="110"/>
+              <w:bottom w:type="dxa" w:w="70"/>
+              <w:right w:type="dxa" w:w="110"/>
+            </w:tcMar>
+            <w:vAlign w:val="center"/>
+          </w:tcPr>
+          <w:p>
+            <w:pPr>
+              <w:spacing w:after="50" w:line="264"/>
+              <w:jc w:val="left"/>
+            </w:pPr>
+            <w:r>
+              <w:rPr>
+                <w:rFonts w:ascii="Times New Roman" w:cs="Times New Roman" w:eastAsia="Times New Roman" w:hAnsi="Times New Roman"/>
+                <w:b w:val="false"/>
+                <w:bCs w:val="false"/>
+                <w:sz w:val="22"/>
+                <w:szCs w:val="22"/>
+              </w:rPr>
+              <w:t xml:space="preserve">Упражнение, групповое обсуждение</w:t>
+            </w:r>
+          </w:p>
+        </w:tc>
+        <w:tc>
+          <w:tcPr>
+            <w:tcW w:type="dxa" w:w="2300"/>
+            <w:tcBorders>
+              <w:top w:val="single" w:color="BFBFBF" w:sz="6"/>
+              <w:left w:val="single" w:color="BFBFBF" w:sz="6"/>
+              <w:bottom w:val="single" w:color="BFBFBF" w:sz="6"/>
+              <w:right w:val="single" w:color="BFBFBF" w:sz="6"/>
+            </w:tcBorders>
+            <w:shd w:fill="F2EFE6" w:color="auto" w:val="clear"/>
+            <w:tcMar>
+              <w:top w:type="dxa" w:w="70"/>
+              <w:left w:type="dxa" w:w="110"/>
+              <w:bottom w:type="dxa" w:w="70"/>
+              <w:right w:type="dxa" w:w="110"/>
+            </w:tcMar>
+            <w:vAlign w:val="center"/>
+          </w:tcPr>
+          <w:p>
+            <w:pPr>
+              <w:spacing w:after="50" w:line="264"/>
+              <w:jc w:val="left"/>
+            </w:pPr>
+            <w:r>
+              <w:rPr>
+                <w:rFonts w:ascii="Times New Roman" w:cs="Times New Roman" w:eastAsia="Times New Roman" w:hAnsi="Times New Roman"/>
+                <w:b w:val="false"/>
+                <w:bCs w:val="false"/>
+                <w:sz w:val="22"/>
+                <w:szCs w:val="22"/>
+              </w:rPr>
+              <w:t xml:space="preserve">Практическое занятие, малые группы</w:t>
+            </w:r>
+          </w:p>
+        </w:tc>
+        <w:tc>
+          <w:tcPr>
+            <w:tcW w:type="dxa" w:w="2538"/>
+            <w:tcBorders>
+              <w:top w:val="single" w:color="BFBFBF" w:sz="6"/>
+              <w:left w:val="single" w:color="BFBFBF" w:sz="6"/>
+              <w:bottom w:val="single" w:color="BFBFBF" w:sz="6"/>
+              <w:right w:val="single" w:color="BFBFBF" w:sz="6"/>
+            </w:tcBorders>
+            <w:shd w:fill="F2EFE6" w:color="auto" w:val="clear"/>
+            <w:tcMar>
+              <w:top w:type="dxa" w:w="70"/>
+              <w:left w:type="dxa" w:w="110"/>
+              <w:bottom w:type="dxa" w:w="70"/>
+              <w:right w:type="dxa" w:w="110"/>
+            </w:tcMar>
+            <w:vAlign w:val="center"/>
+          </w:tcPr>
+          <w:p>
+            <w:pPr>
+              <w:spacing w:after="50" w:line="264"/>
+              <w:jc w:val="left"/>
+            </w:pPr>
+            <w:r>
+              <w:rPr>
+                <w:rFonts w:ascii="Times New Roman" w:cs="Times New Roman" w:eastAsia="Times New Roman" w:hAnsi="Times New Roman"/>
+                <w:b w:val="false"/>
+                <w:bCs w:val="false"/>
+                <w:sz w:val="22"/>
+                <w:szCs w:val="22"/>
+              </w:rPr>
+              <w:t xml:space="preserve">Шаблон «факт, последствие, предложение»</w:t>
+            </w:r>
+          </w:p>
+        </w:tc>
+      </w:tr>
+      <w:tr>
+        <w:trPr>
+          <w:cantSplit/>
+        </w:trPr>
+        <w:tc>
+          <w:tcPr>
+            <w:tcW w:type="dxa" w:w="2500"/>
+            <w:tcBorders>
+              <w:top w:val="single" w:color="BFBFBF" w:sz="6"/>
+              <w:left w:val="single" w:color="BFBFBF" w:sz="6"/>
+              <w:bottom w:val="single" w:color="BFBFBF" w:sz="6"/>
+              <w:right w:val="single" w:color="BFBFBF" w:sz="6"/>
+            </w:tcBorders>
+            <w:tcMar>
+              <w:top w:type="dxa" w:w="70"/>
+              <w:left w:type="dxa" w:w="110"/>
+              <w:bottom w:type="dxa" w:w="70"/>
+              <w:right w:type="dxa" w:w="110"/>
+            </w:tcMar>
+            <w:vAlign w:val="center"/>
+          </w:tcPr>
+          <w:p>
+            <w:pPr>
+              <w:spacing w:after="50" w:line="264"/>
+              <w:jc w:val="left"/>
+            </w:pPr>
+            <w:r>
+              <w:rPr>
+                <w:rFonts w:ascii="Times New Roman" w:cs="Times New Roman" w:eastAsia="Times New Roman" w:hAnsi="Times New Roman"/>
+                <w:b/>
+                <w:bCs/>
+                <w:sz w:val="22"/>
+                <w:szCs w:val="22"/>
+              </w:rPr>
+              <w:t xml:space="preserve">Уметь проектировать процесс контроля качества под ситуацию команды</w:t>
+            </w:r>
+          </w:p>
+        </w:tc>
+        <w:tc>
+          <w:tcPr>
+            <w:tcW w:type="dxa" w:w="2300"/>
+            <w:tcBorders>
+              <w:top w:val="single" w:color="BFBFBF" w:sz="6"/>
+              <w:left w:val="single" w:color="BFBFBF" w:sz="6"/>
+              <w:bottom w:val="single" w:color="BFBFBF" w:sz="6"/>
+              <w:right w:val="single" w:color="BFBFBF" w:sz="6"/>
+            </w:tcBorders>
+            <w:tcMar>
+              <w:top w:type="dxa" w:w="70"/>
+              <w:left w:type="dxa" w:w="110"/>
+              <w:bottom w:type="dxa" w:w="70"/>
+              <w:right w:type="dxa" w:w="110"/>
+            </w:tcMar>
+            <w:vAlign w:val="center"/>
+          </w:tcPr>
+          <w:p>
+            <w:pPr>
+              <w:spacing w:after="50" w:line="264"/>
+              <w:jc w:val="left"/>
+            </w:pPr>
+            <w:r>
+              <w:rPr>
+                <w:rFonts w:ascii="Times New Roman" w:cs="Times New Roman" w:eastAsia="Times New Roman" w:hAnsi="Times New Roman"/>
+                <w:b w:val="false"/>
+                <w:bCs w:val="false"/>
+                <w:sz w:val="22"/>
+                <w:szCs w:val="22"/>
+              </w:rPr>
+              <w:t xml:space="preserve">Кейс-стади, дискуссия (интерактивные методы)</w:t>
+            </w:r>
+          </w:p>
+        </w:tc>
+        <w:tc>
+          <w:tcPr>
+            <w:tcW w:type="dxa" w:w="2300"/>
+            <w:tcBorders>
+              <w:top w:val="single" w:color="BFBFBF" w:sz="6"/>
+              <w:left w:val="single" w:color="BFBFBF" w:sz="6"/>
+              <w:bottom w:val="single" w:color="BFBFBF" w:sz="6"/>
+              <w:right w:val="single" w:color="BFBFBF" w:sz="6"/>
+            </w:tcBorders>
+            <w:tcMar>
+              <w:top w:type="dxa" w:w="70"/>
+              <w:left w:type="dxa" w:w="110"/>
+              <w:bottom w:type="dxa" w:w="70"/>
+              <w:right w:type="dxa" w:w="110"/>
+            </w:tcMar>
+            <w:vAlign w:val="center"/>
+          </w:tcPr>
+          <w:p>
+            <w:pPr>
+              <w:spacing w:after="50" w:line="264"/>
+              <w:jc w:val="left"/>
+            </w:pPr>
+            <w:r>
+              <w:rPr>
+                <w:rFonts w:ascii="Times New Roman" w:cs="Times New Roman" w:eastAsia="Times New Roman" w:hAnsi="Times New Roman"/>
+                <w:b w:val="false"/>
+                <w:bCs w:val="false"/>
+                <w:sz w:val="22"/>
+                <w:szCs w:val="22"/>
+              </w:rPr>
+              <w:t xml:space="preserve">Практическое занятие, малые группы → фронтально</w:t>
+            </w:r>
+          </w:p>
+        </w:tc>
+        <w:tc>
+          <w:tcPr>
+            <w:tcW w:type="dxa" w:w="2538"/>
+            <w:tcBorders>
+              <w:top w:val="single" w:color="BFBFBF" w:sz="6"/>
+              <w:left w:val="single" w:color="BFBFBF" w:sz="6"/>
+              <w:bottom w:val="single" w:color="BFBFBF" w:sz="6"/>
+              <w:right w:val="single" w:color="BFBFBF" w:sz="6"/>
+            </w:tcBorders>
+            <w:tcMar>
+              <w:top w:type="dxa" w:w="70"/>
+              <w:left w:type="dxa" w:w="110"/>
+              <w:bottom w:type="dxa" w:w="70"/>
+              <w:right w:type="dxa" w:w="110"/>
+            </w:tcMar>
+            <w:vAlign w:val="center"/>
+          </w:tcPr>
+          <w:p>
+            <w:pPr>
+              <w:spacing w:after="50" w:line="264"/>
+              <w:jc w:val="left"/>
+            </w:pPr>
+            <w:r>
+              <w:rPr>
+                <w:rFonts w:ascii="Times New Roman" w:cs="Times New Roman" w:eastAsia="Times New Roman" w:hAnsi="Times New Roman"/>
+                <w:b w:val="false"/>
+                <w:bCs w:val="false"/>
+                <w:sz w:val="22"/>
+                <w:szCs w:val="22"/>
+              </w:rPr>
+              <w:t xml:space="preserve">Текст кейса, рубрика взаимооценки</w:t>
+            </w:r>
+          </w:p>
+        </w:tc>
+      </w:tr>
+      <w:tr>
+        <w:trPr>
+          <w:cantSplit/>
+        </w:trPr>
+        <w:tc>
+          <w:tcPr>
+            <w:tcW w:type="dxa" w:w="2500"/>
+            <w:tcBorders>
+              <w:top w:val="single" w:color="BFBFBF" w:sz="6"/>
+              <w:left w:val="single" w:color="BFBFBF" w:sz="6"/>
+              <w:bottom w:val="single" w:color="BFBFBF" w:sz="6"/>
+              <w:right w:val="single" w:color="BFBFBF" w:sz="6"/>
+            </w:tcBorders>
+            <w:shd w:fill="F2EFE6" w:color="auto" w:val="clear"/>
+            <w:tcMar>
+              <w:top w:type="dxa" w:w="70"/>
+              <w:left w:type="dxa" w:w="110"/>
+              <w:bottom w:type="dxa" w:w="70"/>
+              <w:right w:type="dxa" w:w="110"/>
+            </w:tcMar>
+            <w:vAlign w:val="center"/>
+          </w:tcPr>
+          <w:p>
+            <w:pPr>
+              <w:spacing w:after="50" w:line="264"/>
+              <w:jc w:val="left"/>
+            </w:pPr>
+            <w:r>
+              <w:rPr>
+                <w:rFonts w:ascii="Times New Roman" w:cs="Times New Roman" w:eastAsia="Times New Roman" w:hAnsi="Times New Roman"/>
+                <w:b/>
+                <w:bCs/>
+                <w:sz w:val="22"/>
+                <w:szCs w:val="22"/>
+              </w:rPr>
+              <w:t xml:space="preserve">Закрепить навык на собственном коде</w:t>
+            </w:r>
+          </w:p>
+        </w:tc>
+        <w:tc>
+          <w:tcPr>
+            <w:tcW w:type="dxa" w:w="2300"/>
+            <w:tcBorders>
+              <w:top w:val="single" w:color="BFBFBF" w:sz="6"/>
+              <w:left w:val="single" w:color="BFBFBF" w:sz="6"/>
+              <w:bottom w:val="single" w:color="BFBFBF" w:sz="6"/>
+              <w:right w:val="single" w:color="BFBFBF" w:sz="6"/>
+            </w:tcBorders>
+            <w:shd w:fill="F2EFE6" w:color="auto" w:val="clear"/>
+            <w:tcMar>
+              <w:top w:type="dxa" w:w="70"/>
+              <w:left w:type="dxa" w:w="110"/>
+              <w:bottom w:type="dxa" w:w="70"/>
+              <w:right w:type="dxa" w:w="110"/>
+            </w:tcMar>
+            <w:vAlign w:val="center"/>
+          </w:tcPr>
+          <w:p>
+            <w:pPr>
+              <w:spacing w:after="50" w:line="264"/>
+              <w:jc w:val="left"/>
+            </w:pPr>
+            <w:r>
+              <w:rPr>
+                <w:rFonts w:ascii="Times New Roman" w:cs="Times New Roman" w:eastAsia="Times New Roman" w:hAnsi="Times New Roman"/>
+                <w:b w:val="false"/>
+                <w:bCs w:val="false"/>
+                <w:sz w:val="22"/>
+                <w:szCs w:val="22"/>
+              </w:rPr>
+              <w:t xml:space="preserve">Исследовательский (самостоятельная работа)</w:t>
+            </w:r>
+          </w:p>
+        </w:tc>
+        <w:tc>
+          <w:tcPr>
+            <w:tcW w:type="dxa" w:w="2300"/>
+            <w:tcBorders>
+              <w:top w:val="single" w:color="BFBFBF" w:sz="6"/>
+              <w:left w:val="single" w:color="BFBFBF" w:sz="6"/>
+              <w:bottom w:val="single" w:color="BFBFBF" w:sz="6"/>
+              <w:right w:val="single" w:color="BFBFBF" w:sz="6"/>
+            </w:tcBorders>
+            <w:shd w:fill="F2EFE6" w:color="auto" w:val="clear"/>
+            <w:tcMar>
+              <w:top w:type="dxa" w:w="70"/>
+              <w:left w:type="dxa" w:w="110"/>
+              <w:bottom w:type="dxa" w:w="70"/>
+              <w:right w:type="dxa" w:w="110"/>
+            </w:tcMar>
+            <w:vAlign w:val="center"/>
+          </w:tcPr>
+          <w:p>
+            <w:pPr>
+              <w:spacing w:after="50" w:line="264"/>
+              <w:jc w:val="left"/>
+            </w:pPr>
+            <w:r>
+              <w:rPr>
+                <w:rFonts w:ascii="Times New Roman" w:cs="Times New Roman" w:eastAsia="Times New Roman" w:hAnsi="Times New Roman"/>
+                <w:b w:val="false"/>
+                <w:bCs w:val="false"/>
+                <w:sz w:val="22"/>
+                <w:szCs w:val="22"/>
+              </w:rPr>
+              <w:t xml:space="preserve">СРС</w:t>
+            </w:r>
+          </w:p>
+        </w:tc>
+        <w:tc>
+          <w:tcPr>
+            <w:tcW w:type="dxa" w:w="2538"/>
+            <w:tcBorders>
+              <w:top w:val="single" w:color="BFBFBF" w:sz="6"/>
+              <w:left w:val="single" w:color="BFBFBF" w:sz="6"/>
+              <w:bottom w:val="single" w:color="BFBFBF" w:sz="6"/>
+              <w:right w:val="single" w:color="BFBFBF" w:sz="6"/>
+            </w:tcBorders>
+            <w:shd w:fill="F2EFE6" w:color="auto" w:val="clear"/>
+            <w:tcMar>
+              <w:top w:type="dxa" w:w="70"/>
+              <w:left w:type="dxa" w:w="110"/>
+              <w:bottom w:type="dxa" w:w="70"/>
+              <w:right w:type="dxa" w:w="110"/>
+            </w:tcMar>
+            <w:vAlign w:val="center"/>
+          </w:tcPr>
+          <w:p>
+            <w:pPr>
+              <w:spacing w:after="50" w:line="264"/>
+              <w:jc w:val="left"/>
+            </w:pPr>
+            <w:r>
+              <w:rPr>
+                <w:rFonts w:ascii="Times New Roman" w:cs="Times New Roman" w:eastAsia="Times New Roman" w:hAnsi="Times New Roman"/>
+                <w:b w:val="false"/>
+                <w:bCs w:val="false"/>
+                <w:sz w:val="22"/>
+                <w:szCs w:val="22"/>
+              </w:rPr>
+              <w:t xml:space="preserve">Репозиторий своего проекта, чек-лист ревью</w:t>
+            </w:r>
+          </w:p>
+        </w:tc>
+      </w:tr>
+    </w:tbl>
+    <w:p>
+      <w:pPr>
+        <w:spacing w:after="60"/>
+      </w:pPr>
     </w:p>
     <w:p>
       <w:pPr>
@@ -6190,10 +6115,20 @@
       <w:r>
         <w:rPr>
           <w:rFonts w:ascii="Times New Roman" w:cs="Times New Roman" w:eastAsia="Times New Roman" w:hAnsi="Times New Roman"/>
+          <w:b/>
+          <w:bCs/>
           <w:sz w:val="26"/>
           <w:szCs w:val="26"/>
         </w:rPr>
-        <w:t xml:space="preserve">Метод обучения, приём, средство, форма организации обучения, лекция, семинар, практическое и лабораторное занятие, СРС, активные и интерактивные методы, кейс-стади, деловая игра, перевёрнутая лекция, взаимное оценивание.</w:t>
+        <w:t xml:space="preserve">Используемые понятия темы: </w:t>
+      </w:r>
+      <w:r>
+        <w:rPr>
+          <w:rFonts w:ascii="Times New Roman" w:cs="Times New Roman" w:eastAsia="Times New Roman" w:hAnsi="Times New Roman"/>
+          <w:sz w:val="26"/>
+          <w:szCs w:val="26"/>
+        </w:rPr>
+        <w:t xml:space="preserve">метод обучения, приём, средство, форма организации обучения, практическое занятие, СРС, активные и интерактивные методы, кейс-стади, взаимное оценивание.</w:t>
       </w:r>
     </w:p>
     <w:sectPr>
@@ -6383,30 +6318,6 @@
     </w:lvl>
   </w:abstractNum>
   <w:abstractNum w:abstractNumId="3" w15:restartNumberingAfterBreak="0">
-    <w:multiLevelType w:val="hybridMultilevel"/>
-    <w:lvl w:ilvl="0" w15:tentative="1">
-      <w:start w:val="1"/>
-      <w:numFmt w:val="decimal"/>
-      <w:lvlText w:val="%1."/>
-      <w:lvlJc w:val="left"/>
-      <w:pPr>
-        <w:ind w:left="420" w:hanging="300"/>
-      </w:pPr>
-    </w:lvl>
-  </w:abstractNum>
-  <w:abstractNum w:abstractNumId="4" w15:restartNumberingAfterBreak="0">
-    <w:multiLevelType w:val="hybridMultilevel"/>
-    <w:lvl w:ilvl="0" w15:tentative="1">
-      <w:start w:val="1"/>
-      <w:numFmt w:val="decimal"/>
-      <w:lvlText w:val="%1."/>
-      <w:lvlJc w:val="left"/>
-      <w:pPr>
-        <w:ind w:left="420" w:hanging="300"/>
-      </w:pPr>
-    </w:lvl>
-  </w:abstractNum>
-  <w:abstractNum w:abstractNumId="5" w15:restartNumberingAfterBreak="0">
     <w:multiLevelType w:val="hybridMultilevel"/>
     <w:lvl w:ilvl="0" w15:tentative="1">
       <w:start w:val="1"/>

</xml_diff>

<commit_message>
Set single author on practical lesson plan
Co-Authored-By: Claude Fable 5.1 <noreply@anthropic.com>
Claude-Session: https://claude.ai/code/session_01LeAKLyWUugijbBRVjkp6kE
</commit_message>
<xml_diff>
--- a/Практическое_занятие_Методы_и_формы_обучения.docx
+++ b/Практическое_занятие_Методы_и_формы_обучения.docx
@@ -63,7 +63,7 @@
           <w:sz w:val="26"/>
           <w:szCs w:val="26"/>
         </w:rPr>
-        <w:t xml:space="preserve">Разработали: </w:t>
+        <w:t xml:space="preserve">Разработал: </w:t>
       </w:r>
       <w:r>
         <w:rPr>
@@ -71,7 +71,7 @@
           <w:sz w:val="26"/>
           <w:szCs w:val="26"/>
         </w:rPr>
-        <w:t xml:space="preserve">Капулер Дмитрий, Аскарулы Расул, Асылбек Али, Асылханов Рамазан</w:t>
+        <w:t xml:space="preserve">Капулер Дмитрий</w:t>
       </w:r>
     </w:p>
     <w:p>

</xml_diff>